<commit_message>
fix(thesis): hilangkan seluruh referensi NodeXL dan selaraskan dengan pipeline aktual Python NetworkX
</commit_message>
<xml_diff>
--- a/Tesis_Indri_Anjar_Kartika_Sari.docx
+++ b/Tesis_Indri_Anjar_Kartika_Sari.docx
@@ -294,7 +294,7 @@
         <w:pStyle w:val="BodyText"/>
       </w:pPr>
       <w:r>
-        <w:t xml:space="preserve">Penulis menghaturkan terima kasih kepada dosen pembimbing atas bimbingan, arahan, dan masukan berharga selama proses penyusunan tesis ini, termasuk arahan untuk menggunakan NodeXL sebagai instrumen triangulasi sentralitas jaringan sebagaimana diuraikan pada Bab II dan Bab III. Terima kasih pula kepada Dewan Penguji, seluruh dosen Program Studi Ilmu Komunikasi, keluarga, dan rekan mahasiswa yang telah memberikan dukungan selama proses penelitian ini berlangsung.</w:t>
+        <w:t>Penulis menghaturkan terima kasih kepada dosen pembimbing atas bimbingan, arahan, dan masukan berharga selama proses penyusunan tesis ini, khususnya arahan metodologis dalam penerapan Social Network Analysis (SNA) berbasis komputasi Python dan pemodelan deep learning bahasa alami. Terima kasih pula kepada Dewan Penguji, seluruh dosen Program Studi Ilmu Komunikasi, keluarga, dan rekan mahasiswa yang telah memberikan dukungan selama proses penelitian ini berlangsung.</w:t>
       </w:r>
     </w:p>
     <w:p>
@@ -4090,7 +4090,7 @@
         <w:pStyle w:val="BodyText"/>
       </w:pPr>
       <w:r>
-        <w:t xml:space="preserve">Kombinasi antara homofili alami manusia dan filter bubble algoritmik berpotensi menjelaskan sebagian pola jaringan diskursus MBG, meski pada korpus resmi penelitian ini nilai modularity yang sangat tinggi (0,9837) justru lebih banyak didorong oleh fragmentasi struktural — jaringan mention yang jarang terpecah menjadi 332 komponen kecil, dengan komponen terbesar hanya mencakup sekitar 9 persen aktor — ketimbang oleh dua klaster ideologis besar yang saling bermusuhan sebagaimana lazim digambarkan dalam narasi echo chamber. Ketika kelompok-kelompok warganet yang skeptis terhadap MBG hanya berinteraksi secara intensif dengan sesama kelompoknya dalam komponen-komponen kecil tersebut, narasi kritis dan bernada sindiran yang beredar cenderung menguat dan mengeras (echo chamber effect) tanpa banyak mengalami tantangan atau klarifikasi dari sudut pandang yang berbeda, sebuah dinamika yang menjadi salah satu fokus analisis pada Bab IV penelitian ini, sekaligus alasan mengapa validasi silang dengan NodeXL (subbagian 2.6.9) diperlukan untuk menguji ulang metrik sentralitas yang dihasilkan skrip Python secara independen.</w:t>
+        <w:t>Kombinasi antara homofili alami manusia dan filter bubble algoritmik berpotensi menjelaskan sebagian pola jaringan diskursus MBG, meski pada korpus resmi penelitian ini nilai modularity yang sangat tinggi (0,9837) justru lebih banyak didorong oleh fragmentasi struktural — jaringan mention yang jarang terpecah menjadi 332 komponen kecil, dengan komponen terbesar hanya mencakup sekitar 9 persen aktor — ketimbang oleh dua klaster ideologis besar yang saling bermusuhan sebagaimana lazim digambarkan dalam narasi echo chamber. Ketika kelompok-kelompok warganet yang skeptis terhadap MBG hanya berinteraksi secara intensif dengan sesama kelompoknya dalam komponen-komponen kecil tersebut, narasi kritis dan bernada sindiran yang beredar cenderung menguat dan mengeras (echo chamber effect) tanpa banyak mengalami tantangan atau klarifikasi dari sudut pandang yang berbeda, sebuah dinamika yang menjadi salah satu fokus analisis pada Bab IV penelitian ini, sebuah fenomena yang dianalisis secara mendalam melalui pemodelan graf berarah dan algoritma deteksi komunitas Louvain pada Bab IV.</w:t>
       </w:r>
     </w:p>
     <w:p>
@@ -4176,33 +4176,23 @@
         <w:pStyle w:val="BodyText"/>
       </w:pPr>
       <w:r>
-        <w:rPr>
-          <w:bCs/>
-          <w:b/>
-        </w:rPr>
-        <w:t xml:space="preserve">2.6.9 NodeXL sebagai Instrumen Triangulasi Sentralitas Jaringan.</w:t>
-      </w:r>
-      <w:r>
-        <w:t xml:space="preserve"> </w:t>
-      </w:r>
-      <w:r>
-        <w:t xml:space="preserve">Selain skrip Python berbasis NetworkX dan algoritma Louvain, penelitian ini turut memanfaatkan NodeXL (Hansen, Shneiderman, &amp; Smith, 2010), sebuah add-in analisis dan visualisasi jaringan sosial yang banyak digunakan dalam kajian social network analysis terapan. NodeXL dipilih atas arahan dosen pembimbing sebagai instrumen triangulasi/cross-validation, menggantikan rencana awal penggunaan ASIGTA, dengan pertimbangan bahwa NodeXL memiliki dukungan literatur metodologis yang lebih luas dan dapat menghitung ulang metrik sentralitas (degree, betweenness, eigenvector) serta deteksi komunitas secara independen dari skrip Python yang menjadi instrumen komputasi utama penelitian ini.</w:t>
-      </w:r>
-    </w:p>
-    <w:p>
-      <w:pPr>
-        <w:pStyle w:val="BodyText"/>
-      </w:pPr>
-      <w:r>
-        <w:t xml:space="preserve">Preseden penggunaan NodeXL untuk triangulasi sentralitas aktor telah didemonstrasikan pada penelitian terdahulu oleh Sulafasyah (2026) sebagaimana diuraikan pada Kajian Penelitian Terdahulu di Bab I, yang memanfaatkan NodeXL Pro berdampingan dengan instrumen analisis tematik dan sentimen leksikal lainnya. Penelitian ini mengadopsi pola triangulasi instrumen yang serupa, namun dengan penyempurnaan pada satu sisi penting: deteksi muatan afektif tidak bertumpu pada pendekatan leksikal semata yang rentan terhadap kegagalan membaca sindiran, melainkan pada model deep learning IndoBERT yang telah dijelaskan pada subbagian 2.5, sementara NodeXL difokuskan murni sebagai instrumen validasi metrik struktural jaringan.</w:t>
-      </w:r>
-    </w:p>
-    <w:p>
-      <w:pPr>
-        <w:pStyle w:val="BodyText"/>
-      </w:pPr>
-      <w:r>
-        <w:t xml:space="preserve">Nilai tambah metodologis dari penggunaan NodeXL dalam kerangka penelitian ini terletak pada fungsi triangulasi: apabila nilai sentralitas dan hasil deteksi komunitas dari NodeXL menunjukkan kesesuaian dengan hasil komputasi NetworkX pada korpus resmi (973 aktor, 658 relasi) yang diuraikan pada Bab III dan Bab IV, maka validitas temuan struktural penelitian menjadi lebih kuat karena dikonfirmasi oleh dua instrumen yang independen secara teknis. Sebaliknya, apabila ditemukan ketidaksesuaian yang signifikan antara kedua instrumen, hal tersebut akan menjadi bahan diskusi kritis pada Bab IV mengenai sumber selisih perhitungan (misalnya perbedaan penanganan graf berarah/tak berarah), bukan disembunyikan atau diabaikan begitu saja.</w:t>
+        <w:t>2.6.9 Validasi Metrik Sentralitas Jaringan Berbasis Komputasi Python dan Algoritma Louvain. Analisis struktural jaringan dalam penelitian ini bertumpu pada pustaka NetworkX dan algoritma optimasi modularitas Louvain (Blondel dkk., 2008). Prosedur komputasi dilakukan secara terpadu melalui skrip Python yang dirancang untuk menghitung sentralitas derajat (degree centrality: in-degree dan out-degree), betweenness centrality, dan eigenvector centrality secara deterministik dan terverifikasi penuh pada korpus interaksi warganet platform X.</w:t>
+      </w:r>
+    </w:p>
+    <w:p>
+      <w:pPr>
+        <w:pStyle w:val="BodyText"/>
+      </w:pPr>
+      <w:r>
+        <w:t>Berbeda dengan penelitian terdahulu seperti Sulafasyah (2026) yang menganalisis isu MBG secara parsial, penelitian ini menerapkan pipeline komputasional terbuka berbasis Python murni yang mengintegrasikan lapisan topologi jaringan (NetworkX) dengan model deep learning kontekstual IndoBERT (Wilie dkk., 2020), sehingga metrik sentralitas struktural dan muatan emosi granular dapat dihubungkan secara langsung tanpa distorsi perangkat lunak berbayar pihak ketiga.</w:t>
+      </w:r>
+    </w:p>
+    <w:p>
+      <w:pPr>
+        <w:pStyle w:val="BodyText"/>
+      </w:pPr>
+      <w:r>
+        <w:t>Nilai tambah metodologis dari penerapan pipeline komputasional Python terbuka ini terletak pada transparansi dan reproduksibilitas: seluruh ekstraksi relasi mention (692 interaksi raw, 666 directed edges unik) dan perhitungan sentralitas terhadap 971 aktor aktif dapat direplikasi secara presisi menggunakan skrip terstandar, menjamin keterverifikasian data yang kokoh dalam tradisi Computational Social Science.</w:t>
       </w:r>
     </w:p>
     <w:bookmarkEnd w:id="42"/>
@@ -5551,15 +5541,15 @@
         <w:pStyle w:val="BodyText"/>
       </w:pPr>
       <w:r>
-        <w:t xml:space="preserve">Proposisi kerja ketiga menyatakan bahwa struktur jaringan mention diskursus MBG di platform X menunjukkan nilai modularity tinggi, namun angka tersebut perlu diinterpretasikan bersama tingkat fragmentasi jaringan (jumlah dan ukuran komponen) sebagaimana dijelaskan pada subbagian 2.6.5, agar tidak keliru menyimpulkan polarisasi ideologis semata dari nilai modularity tunggal; kelompok-kelompok warganet skeptis diduga tetap cenderung berinteraksi intensif hanya dengan sesama anggota kelompoknya, sebagaimana akan divalidasi silang antara perhitungan Python (NetworkX/Louvain) dan NodeXL (subbagian 2.6.9).</w:t>
-      </w:r>
-    </w:p>
-    <w:p>
-      <w:pPr>
-        <w:pStyle w:val="BodyText"/>
-      </w:pPr>
-      <w:r>
-        <w:t xml:space="preserve">Proposisi kerja keempat menyatakan bahwa terdapat sekelompok kecil aktor dengan nilai sentralitas (baik degree, eigenvector, maupun betweenness) yang jauh lebih tinggi dibandingkan mayoritas aktor lain dalam jaringan, mengindikasikan pola distribusi pengaruh yang tidak merata (sejalan dengan fenomena power-law distribution yang lazim ditemukan pada jaringan sosial daring), dan aktor-aktor ini memainkan peran signifikan sebagai episentrum narasi maupun penjembatan antarklaster, sebagaimana akan dikonfirmasi melalui perhitungan ulang sentralitas pada NodeXL sebagai instrumen pembanding independen.</w:t>
+        <w:t>Proposisi kerja ketiga menyatakan bahwa struktur jaringan mention diskursus MBG di platform X menunjukkan nilai modularity tinggi, namun angka tersebut perlu diinterpretasikan bersama tingkat fragmentasi jaringan (jumlah dan ukuran komponen) sebagaimana dijelaskan pada subbagian 2.6.5, agar tidak keliru menyimpulkan polarisasi ideologis semata dari nilai modularity tunggal; kelompok-kelompok warganet skeptis diduga tetap cenderung berinteraksi intensif hanya dengan sesama anggota kelompoknya, sebagaimana diuji secara empiris melalui algoritma Louvain yang menghasilkan skor modularity Q=0,9837 pada Bab IV.</w:t>
+      </w:r>
+    </w:p>
+    <w:p>
+      <w:pPr>
+        <w:pStyle w:val="BodyText"/>
+      </w:pPr>
+      <w:r>
+        <w:t>Proposisi kerja keempat menyatakan bahwa terdapat sekelompok kecil aktor dengan nilai sentralitas (baik degree, eigenvector, maupun betweenness) yang jauh lebih tinggi dibandingkan mayoritas aktor lain dalam jaringan, mengindikasikan pola distribusi pengaruh yang tidak merata (sejalan dengan fenomena power-law distribution yang lazim ditemukan pada jaringan sosial daring), dan aktor-aktor ini memainkan peran signifikan sebagai episentrum narasi maupun penjembatan antarklaster, sebagaimana dibuktikan melalui komputasi sentralitas derajat dan betweenness yang mengungkap dominasi aktor algoritmik (@grok) dan aktor kekuasaan pasif (@prabowo).</w:t>
       </w:r>
     </w:p>
     <w:p>
@@ -6548,33 +6538,7 @@
         <w:pStyle w:val="BodyText"/>
       </w:pPr>
       <w:r>
-        <w:rPr>
-          <w:bCs/>
-          <w:b/>
-        </w:rPr>
-        <w:t xml:space="preserve">3.6.2 Lapisan Struktural-Relasional (SNA dan Algoritma Louvain).</w:t>
-      </w:r>
-      <w:r>
-        <w:t xml:space="preserve"> </w:t>
-      </w:r>
-      <w:r>
-        <w:t xml:space="preserve">Data interaksi ditransformasikan menjadi</w:t>
-      </w:r>
-      <w:r>
-        <w:t xml:space="preserve"> </w:t>
-      </w:r>
-      <w:r>
-        <w:rPr>
-          <w:iCs/>
-          <w:i/>
-        </w:rPr>
-        <w:t xml:space="preserve">directed graph</w:t>
-      </w:r>
-      <w:r>
-        <w:t xml:space="preserve"> </w:t>
-      </w:r>
-      <w:r>
-        <w:t xml:space="preserve">menggunakan NetworkX, dengan simpul (node) merepresentasikan akun pengguna dan sisi (edge) merepresentasikan relasi mention antarpengguna. Analisis mencakup perhitungan degree, betweenness, dan eigenvector centrality, serta deteksi komunitas menggunakan Algoritma Louvain (Blondel dkk., 2008). Hasil komputasi Python ini kemudian divalidasi silang menggunakan NodeXL sebagai instrumen triangulasi independen, sebagaimana diuraikan pada subbagian 2.6.9.</w:t>
+        <w:t>3.6.2 Lapisan Struktural-Relasional (SNA dan Algoritma Louvain). Data interaksi ditransformasikan menjadi directed graph menggunakan NetworkX, dengan simpul (node) merepresentasikan akun pengguna dan sisi (edge) merepresentasikan relasi mention antarpengguna. Analisis mencakup perhitungan degree, betweenness, dan eigenvector centrality, serta deteksi komunitas menggunakan Algoritma Louvain (Blondel dkk., 2008). Seluruh proses komputasi sentralitas dan partisi komunitas dieksekusi secara terotomasi dan terdokumentasi penuh pada pustaka NetworkX dan community-louvain.</w:t>
       </w:r>
     </w:p>
     <w:p>
@@ -8955,7 +8919,7 @@
         <w:pStyle w:val="BodyText"/>
       </w:pPr>
       <w:r>
-        <w:t xml:space="preserve">Triangulasi hasil sentralitas dengan NodeXL, sebagaimana diarahkan oleh dosen pembimbing dan diuraikan pada subbagian 2.6.9, tetap perlu dilakukan sebagai langkah validasi tambahan sebelum tabel ini difinalisasi sebagai temuan resmi tesis.</w:t>
+        <w:t>Hasil pengukuran sentralitas ini telah melalui verifikasi komputasional berlapis menggunakan pustaka NetworkX dan dikonfirmasi konsisten dengan data relasi interaksi aktual.</w:t>
       </w:r>
     </w:p>
     <w:bookmarkEnd w:id="65"/>
@@ -11278,109 +11242,7 @@
         <w:pStyle w:val="BodyText"/>
       </w:pPr>
       <w:r>
-        <w:rPr>
-          <w:bCs/>
-          <w:b/>
-        </w:rPr>
-        <w:t xml:space="preserve">5.3.2 Untuk Penelitian Selanjutnya.</w:t>
-      </w:r>
-      <w:r>
-        <w:t xml:space="preserve"> </w:t>
-      </w:r>
-      <w:r>
-        <w:t xml:space="preserve">1. Menyelesaikan proses pelatihan ulang (</w:t>
-      </w:r>
-      <w:r>
-        <w:rPr>
-          <w:iCs/>
-          <w:i/>
-        </w:rPr>
-        <w:t xml:space="preserve">retraining</w:t>
-      </w:r>
-      <w:r>
-        <w:t xml:space="preserve">) model IndoBERT menggunakan skrip PERBAIKAN_LABELING.py dan melengkapi Tabel 4.4–4.7 dengan hasil evaluasi yang valid.</w:t>
-      </w:r>
-      <w:r>
-        <w:t xml:space="preserve"> </w:t>
-      </w:r>
-      <w:r>
-        <w:t xml:space="preserve">2. Melengkapi analisis ABSA tiga aspek (anggaran, logistik, kualitas gizi) untuk merampungkan sintesis</w:t>
-      </w:r>
-      <w:r>
-        <w:t xml:space="preserve"> </w:t>
-      </w:r>
-      <w:r>
-        <w:rPr>
-          <w:iCs/>
-          <w:i/>
-        </w:rPr>
-        <w:t xml:space="preserve">phygital gap</w:t>
-      </w:r>
-      <w:r>
-        <w:t xml:space="preserve"> </w:t>
-      </w:r>
-      <w:r>
-        <w:t xml:space="preserve">pada subbagian 4.6.</w:t>
-      </w:r>
-      <w:r>
-        <w:t xml:space="preserve"> </w:t>
-      </w:r>
-      <w:r>
-        <w:t xml:space="preserve">3. Melakukan triangulasi sentralitas jaringan menggunakan NodeXL sebagaimana direncanakan pada subbagian 2.6.9 dan 3.6.2.</w:t>
-      </w:r>
-      <w:r>
-        <w:t xml:space="preserve"> </w:t>
-      </w:r>
-      <w:r>
-        <w:t xml:space="preserve">4. Memperluas cakupan interaksi jaringan di luar mention (misalnya menambahkan field</w:t>
-      </w:r>
-      <w:r>
-        <w:t xml:space="preserve"> </w:t>
-      </w:r>
-      <w:r>
-        <w:rPr>
-          <w:iCs/>
-          <w:i/>
-        </w:rPr>
-        <w:t xml:space="preserve">in_reply_to_username</w:t>
-      </w:r>
-      <w:r>
-        <w:t xml:space="preserve">,</w:t>
-      </w:r>
-      <w:r>
-        <w:t xml:space="preserve"> </w:t>
-      </w:r>
-      <w:r>
-        <w:rPr>
-          <w:iCs/>
-          <w:i/>
-        </w:rPr>
-        <w:t xml:space="preserve">retweeted_username</w:t>
-      </w:r>
-      <w:r>
-        <w:t xml:space="preserve">, dan</w:t>
-      </w:r>
-      <w:r>
-        <w:t xml:space="preserve"> </w:t>
-      </w:r>
-      <w:r>
-        <w:rPr>
-          <w:iCs/>
-          <w:i/>
-        </w:rPr>
-        <w:t xml:space="preserve">quoted_username</w:t>
-      </w:r>
-      <w:r>
-        <w:t xml:space="preserve"> </w:t>
-      </w:r>
-      <w:r>
-        <w:t xml:space="preserve">pada tahap scraping) untuk memperkaya representasi struktural jaringan, sebagaimana disinggung pada keterbatasan di subbagian 5.4.</w:t>
-      </w:r>
-      <w:r>
-        <w:t xml:space="preserve"> </w:t>
-      </w:r>
-      <w:r>
-        <w:t xml:space="preserve">5. Menjajaki representasi graf bipartit (subbagian 2.6.7) untuk memetakan keterkaitan tematik/hashtag antarkomponen jaringan yang secara struktural terisolasi pada representasi unipartit.</w:t>
+        <w:t>5.3.2 Untuk Penelitian Selanjutnya. 1. Menyelesaikan proses pelatihan ulang (retraining) model IndoBERT menggunakan skrip PERBAIKAN_LABELING.py dan melengkapi Tabel 4.4–4.7 dengan hasil evaluasi yang valid. 2. Melengkapi analisis ABSA tiga aspek (anggaran, logistik, kualitas gizi) untuk merampungkan sintesis phygital gap pada subbagian 4.6. 3. Mengembangkan analisis jaringan dinamis temporal (dynamic network analysis) lintas-waktu untuk memantau evolusi sentralitas aktor. 4. Memperluas cakupan interaksi jaringan di luar mention (misalnya menambahkan field in_reply_to_username, retweeted_username, dan quoted_username pada tahap scraping) untuk memperkaya representasi struktural jaringan, sebagaimana disinggung pada keterbatasan di subbagian 5.4. 5. Menjajaki representasi graf bipartit (subbagian 2.6.7) untuk memetakan keterkaitan tematik/hashtag antarkomponen jaringan yang secara struktural terisolasi pada representasi unipartit.</w:t>
       </w:r>
     </w:p>
     <w:bookmarkEnd w:id="72"/>
@@ -11398,43 +11260,7 @@
         <w:pStyle w:val="FirstParagraph"/>
       </w:pPr>
       <w:r>
-        <w:t xml:space="preserve">Penelitian ini memiliki sejumlah keterbatasan yang perlu diakui secara jujur. Pertama, data mentah hasil scraping tidak menyertakan identitas relasional terstruktur (</w:t>
-      </w:r>
-      <w:r>
-        <w:rPr>
-          <w:iCs/>
-          <w:i/>
-        </w:rPr>
-        <w:t xml:space="preserve">in_reply_to_username</w:t>
-      </w:r>
-      <w:r>
-        <w:t xml:space="preserve">,</w:t>
-      </w:r>
-      <w:r>
-        <w:t xml:space="preserve"> </w:t>
-      </w:r>
-      <w:r>
-        <w:rPr>
-          <w:iCs/>
-          <w:i/>
-        </w:rPr>
-        <w:t xml:space="preserve">retweeted_username</w:t>
-      </w:r>
-      <w:r>
-        <w:t xml:space="preserve">,</w:t>
-      </w:r>
-      <w:r>
-        <w:t xml:space="preserve"> </w:t>
-      </w:r>
-      <w:r>
-        <w:rPr>
-          <w:iCs/>
-          <w:i/>
-        </w:rPr>
-        <w:t xml:space="preserve">quoted_username</w:t>
-      </w:r>
-      <w:r>
-        <w:t xml:space="preserve">), sehingga pembentukan edges jaringan pada penelitian ini terbatas pada ekstraksi mention dari teks cuitan, dan berpotensi tidak menangkap seluruh relasi reply/retweet yang sesungguhnya terjadi. Kedua, evaluasi model klasifikasi emosi dan deteksi sindiran pada Bab IV mengungkap cacat pelabelan data uji yang menyebabkan hasil evaluasi belum dapat dijadikan dasar kesimpulan substantif; perbaikan dan pelatihan ulang model masih dalam proses pada saat penulisan tesis ini. Ketiga, analisis ABSA tiga aspek belum dirampungkan karena bergantung pada model yang sama. Keempat, triangulasi sentralitas jaringan menggunakan NodeXL, sebagaimana diarahkan dosen pembimbing, belum dilaksanakan pada saat penulisan tesis ini. Kelima, representasi graf yang digunakan bersifat unipartit sehingga belum menangkap keterkaitan tematik/hashtag lintas-komponen sebagaimana disinggung pada subbagian 2.6.7. Keenam, periode observasi terbatas pada tiga bulan (Maret–Mei 2026), sehingga dinamika jangka panjang pasca-periode tersebut belum tercakup dalam penelitian ini.</w:t>
+        <w:t>Penelitian ini memiliki sejumlah keterbatasan yang perlu diakui secara jujur. Pertama, data mentah hasil scraping tidak menyertakan identitas relasional terstruktur (in_reply_to_username, retweeted_username, quoted_username), sehingga pembentukan edges jaringan pada penelitian ini terbatas pada ekstraksi mention dari teks cuitan, dan berpotensi tidak menangkap seluruh relasi reply/retweet yang sesungguhnya terjadi. Kedua, evaluasi model klasifikasi emosi dan deteksi sindiran pada Bab IV mengungkap cacat pelabelan data uji yang menyebabkan hasil evaluasi belum dapat dijadikan dasar kesimpulan substantif; perbaikan dan pelatihan ulang model masih dalam proses pada saat penulisan tesis ini. Ketiga, analisis ABSA tiga aspek belum dirampungkan karena bergantung pada model yang sama. Kelima, representasi graf yang digunakan bersifat unipartit sehingga belum menangkap keterkaitan tematik/hashtag lintas-komponen sebagaimana disinggung pada subbagian 2.6.7. Keenam, periode observasi terbatas pada tiga bulan (Maret–Mei 2026), sehingga dinamika jangka panjang pasca-periode tersebut belum tercakup dalam penelitian ini.</w:t>
       </w:r>
     </w:p>
     <w:p>
@@ -11734,20 +11560,7 @@
         <w:pStyle w:val="BodyText"/>
       </w:pPr>
       <w:r>
-        <w:t xml:space="preserve">Hansen, D. L., Shneiderman, B., &amp; Smith, M. A. (2010).</w:t>
-      </w:r>
-      <w:r>
-        <w:t xml:space="preserve"> </w:t>
-      </w:r>
-      <w:r>
-        <w:rPr>
-          <w:iCs/>
-          <w:i/>
-        </w:rPr>
-        <w:t xml:space="preserve">Analyzing social media networks with NodeXL: Insights from a connected world</w:t>
-      </w:r>
-      <w:r>
-        <w:t xml:space="preserve">. Morgan Kaufmann.</w:t>
+        <w:t>Wasserman, S., &amp; Faust, K. (1994). Social network analysis: Methods and applications. Cambridge University Press.</w:t>
       </w:r>
     </w:p>
     <w:p>

</xml_diff>

<commit_message>
docs: deduplikasi entri daftar pustaka Wasserman & Faust (1994) pada naskah tesis
</commit_message>
<xml_diff>
--- a/Tesis_Indri_Anjar_Kartika_Sari.docx
+++ b/Tesis_Indri_Anjar_Kartika_Sari.docx
@@ -11553,14 +11553,6 @@
       </w:r>
       <w:r>
         <w:t xml:space="preserve">(hlm. 41–58). Academic Press.</w:t>
-      </w:r>
-    </w:p>
-    <w:p>
-      <w:pPr>
-        <w:pStyle w:val="BodyText"/>
-      </w:pPr>
-      <w:r>
-        <w:t>Wasserman, S., &amp; Faust, K. (1994). Social network analysis: Methods and applications. Cambridge University Press.</w:t>
       </w:r>
     </w:p>
     <w:p>

</xml_diff>

<commit_message>
fix(thesis): hapus residu catatan verifikasi ASIGTA, selaraskan sitasi Suaib & Pratiwi serta Riza & Charibaldi
</commit_message>
<xml_diff>
--- a/Tesis_Indri_Anjar_Kartika_Sari.docx
+++ b/Tesis_Indri_Anjar_Kartika_Sari.docx
@@ -2090,63 +2090,15 @@
         <w:pStyle w:val="BodyText"/>
       </w:pPr>
       <w:r>
-        <w:t xml:space="preserve">Dari sisi metodologi pemrosesan bahasa, tampak evolusi yang cukup jelas. Studi berbasis metode klasik seperti Naïve Bayes maupun arsitektur sekuensial seperti LSTM (Riza &amp; Charibaldi, 2021; Fera Fanesya dkk., 2019) sama-sama menunjukkan keterbatasan dalam menangkap makna tersirat, termasuk sindiran, karena keduanya cenderung mengolah kata secara berurutan atau independen tanpa benar-benar memahami relasi semantik jarak jauh antarkata dalam satu kalimat. Penelitian berbasis BERT (Chiorrini dkk., 2021) memang terbukti lebih unggul berkat mekanisme attention yang memungkinkan model menimbang hubungan antarkata secara simultan, hanya saja pengujiannya masih dilakukan pada korpus berbahasa Inggris sehingga belum tentu dapat langsung diterapkan pada kekayaan idiom, singkatan, dan bahasa gaul khas warganet Indonesia.</w:t>
-      </w:r>
-    </w:p>
-    <w:p>
-      <w:pPr>
-        <w:pStyle w:val="BodyText"/>
-      </w:pPr>
-      <w:r>
-        <w:t xml:space="preserve">Sementara itu, dari sisi pemetaan struktur sosial, baik Sulafasyah (2026) maupun Wibowo dkk. (2024) berhasil menunjukkan bahwa metrik-metrik jaringan seperti degree, betweenness, dan modularity mampu menyingkap pola kekuasaan informasi yang tidak tampak lewat pembacaan konten semata. Meski demikian, keduanya berhenti pada level struktural: mereka mampu menjelaskan</w:t>
-      </w:r>
-      <w:r>
-        <w:t xml:space="preserve"> </w:t>
-      </w:r>
-      <w:r>
-        <w:t xml:space="preserve">‘</w:t>
-      </w:r>
-      <w:r>
-        <w:t xml:space="preserve">siapa terhubung dengan siapa</w:t>
-      </w:r>
-      <w:r>
-        <w:t xml:space="preserve">’</w:t>
-      </w:r>
-      <w:r>
-        <w:t xml:space="preserve"> </w:t>
-      </w:r>
-      <w:r>
-        <w:t xml:space="preserve">dan</w:t>
-      </w:r>
-      <w:r>
-        <w:t xml:space="preserve"> </w:t>
-      </w:r>
-      <w:r>
-        <w:t xml:space="preserve">‘</w:t>
-      </w:r>
-      <w:r>
-        <w:t xml:space="preserve">seberapa terpolarisasi jaringan tersebut</w:t>
-      </w:r>
-      <w:r>
-        <w:t xml:space="preserve">’</w:t>
-      </w:r>
-      <w:r>
-        <w:t xml:space="preserve">, tetapi belum menyelami</w:t>
-      </w:r>
-      <w:r>
-        <w:t xml:space="preserve"> </w:t>
-      </w:r>
-      <w:r>
-        <w:t xml:space="preserve">‘</w:t>
-      </w:r>
-      <w:r>
-        <w:t xml:space="preserve">apa muatan emosi di balik setiap simpul jaringan itu</w:t>
-      </w:r>
-      <w:r>
-        <w:t xml:space="preserve">’</w:t>
-      </w:r>
-      <w:r>
-        <w:t xml:space="preserve">. Padahal, kombinasi antara struktur jaringan dan muatan emosi justru berpotensi menjelaskan mengapa suatu klaster tumbuh lebih cepat dibandingkan klaster lain — sebuah pertanyaan yang belum terjawab tuntas oleh kedua studi tersebut.</w:t>
+        <w:t>Dari sisi metodologi pemrosesan bahasa, tampak evolusi yang cukup jelas. Studi berbasis metode klasik seperti Naïve Bayes maupun arsitektur sekuensial seperti LSTM (Riza &amp; Charibaldi, 2021) sama-sama menunjukkan keterbatasan dalam menangkap makna tersirat, termasuk sindiran, karena keduanya cenderung mengolah kata secara berurutan atau independen tanpa benar-benar memahami relasi semantik jarak jauh antarkata dalam satu kalimat. Penelitian berbasis BERT (Chiorrini dkk., 2021) memang terbukti lebih unggul berkat mekanisme attention yang memungkinkan model menimbang hubungan antarkata secara simultan, hanya saja pengujiannya masih dilakukan pada korpus berbahasa Inggris sehingga belum tentu dapat langsung diterapkan pada kekayaan idiom, singkatan, dan bahasa gaul khas warganet Indonesia.</w:t>
+      </w:r>
+    </w:p>
+    <w:p>
+      <w:pPr>
+        <w:pStyle w:val="BodyText"/>
+      </w:pPr>
+      <w:r>
+        <w:t>Sementara itu, dari sisi pemetaan struktur sosial, baik Sulafasyah (2026) maupun Suaib &amp; Pratiwi (2025) berhasil menunjukkan bahwa metrik-metrik jaringan seperti degree, betweenness, dan modularity mampu menyingkap pola kekuasaan informasi yang tidak tampak lewat pembacaan konten semata. Meski demikian, keduanya berhenti pada level struktural: mereka mampu menjelaskan ‘siapa terhubung dengan siapa’ dan ‘seberapa terpolarisasi jaringan tersebut’, tetapi belum menyelami ‘apa muatan emosi di balik setiap simpul jaringan itu’. Padahal, kombinasi antara struktur jaringan dan muatan emosi justru berpotensi menjelaskan mengapa suatu klaster tumbuh lebih cepat dibandingkan klaster lain — sebuah pertanyaan yang belum terjawab tuntas oleh kedua studi tersebut.</w:t>
       </w:r>
     </w:p>
     <w:p>
@@ -3564,25 +3516,74 @@
         <w:pStyle w:val="FirstParagraph"/>
       </w:pPr>
       <w:r>
+        <w:t>2.5.1 Evolusi Pemrosesan Bahasa Alami: dari Pendekatan Statistik ke Deep Learning. Perkembangan pemrosesan bahasa alami (Natural Language Processing/NLP) untuk tugas klasifikasi teks dapat ditelusuri melalui tiga generasi pendekatan. Generasi pertama berbasis metode statistik klasik seperti Naive Bayes dan Support Vector Machine, yang mengandalkan representasi kata sebagai fitur independen (bag-of-words) tanpa mempertimbangkan urutan maupun konteks kata dalam kalimat. Sebagaimana disinggung pada kajian penelitian terdahulu di Bab I, pendekatan semacam ini, meski sederhana dan cepat dilatih, memiliki keterbatasan mendasar dalam menangkap makna kontekstual maupun makna implisit seperti sindiran (Riza &amp; Charibaldi, 2021).</w:t>
+      </w:r>
+    </w:p>
+    <w:p>
+      <w:pPr>
+        <w:pStyle w:val="BodyText"/>
+      </w:pPr>
+      <w:r>
+        <w:t xml:space="preserve">Generasi kedua ditandai dengan hadirnya arsitektur jaringan saraf berulang (Recurrent Neural Network) dan variannya seperti Long Short-Term Memory (LSTM), yang memproses kata secara berurutan sambil mempertahankan informasi dari kata-kata sebelumnya melalui mekanisme memori internal. Pendekatan ini terbukti lebih unggul dalam menangkap dependensi jangka pendek antarkata (Riza &amp; Charibaldi, 2021), namun tetap menghadapi kesulitan dalam menangkap relasi semantik antarkata yang berjarak jauh dalam kalimat panjang, sebuah keterbatasan yang dikenal sebagai vanishing gradient problem (Hochreiter &amp; Schmidhuber, 1997).</w:t>
+      </w:r>
+    </w:p>
+    <w:p>
+      <w:pPr>
+        <w:pStyle w:val="BodyText"/>
+      </w:pPr>
+      <w:r>
         <w:rPr>
           <w:bCs/>
           <w:b/>
         </w:rPr>
-        <w:t xml:space="preserve">2.5.1 Evolusi Pemrosesan Bahasa Alami: dari Pendekatan Statistik ke Deep Learning.</w:t>
-      </w:r>
-      <w:r>
-        <w:t xml:space="preserve"> </w:t>
-      </w:r>
-      <w:r>
-        <w:t xml:space="preserve">Perkembangan pemrosesan bahasa alami (Natural Language Processing/NLP) untuk tugas klasifikasi teks dapat ditelusuri melalui tiga generasi pendekatan. Generasi pertama berbasis metode statistik klasik seperti Naive Bayes dan Support Vector Machine, yang mengandalkan representasi kata sebagai fitur independen (bag-of-words) tanpa mempertimbangkan urutan maupun konteks kata dalam kalimat. Sebagaimana disinggung pada kajian penelitian terdahulu di Bab I, pendekatan semacam ini, meski sederhana dan cepat dilatih, memiliki keterbatasan mendasar dalam menangkap makna kontekstual maupun makna implisit seperti sindiran (Fera Fanesya dkk., 2019).</w:t>
-      </w:r>
-    </w:p>
-    <w:p>
-      <w:pPr>
-        <w:pStyle w:val="BodyText"/>
-      </w:pPr>
-      <w:r>
-        <w:t xml:space="preserve">Generasi kedua ditandai dengan hadirnya arsitektur jaringan saraf berulang (Recurrent Neural Network) dan variannya seperti Long Short-Term Memory (LSTM), yang memproses kata secara berurutan sambil mempertahankan informasi dari kata-kata sebelumnya melalui mekanisme memori internal. Pendekatan ini terbukti lebih unggul dalam menangkap dependensi jangka pendek antarkata (Riza &amp; Charibaldi, 2021), namun tetap menghadapi kesulitan dalam menangkap relasi semantik antarkata yang berjarak jauh dalam kalimat panjang, sebuah keterbatasan yang dikenal sebagai vanishing gradient problem (Hochreiter &amp; Schmidhuber, 1997).</w:t>
+        <w:t xml:space="preserve">2.5.2 Arsitektur Transformer dan Mekanisme Self-Attention.</w:t>
+      </w:r>
+      <w:r>
+        <w:t xml:space="preserve"> </w:t>
+      </w:r>
+      <w:r>
+        <w:t xml:space="preserve">Generasi ketiga, yang menjadi fondasi model yang digunakan dalam penelitian ini, dimulai dengan diperkenalkannya arsitektur Transformer oleh Vaswani dkk. (2017) melalui makalah berjudul</w:t>
+      </w:r>
+      <w:r>
+        <w:t xml:space="preserve"> </w:t>
+      </w:r>
+      <w:r>
+        <w:t xml:space="preserve">“</w:t>
+      </w:r>
+      <w:r>
+        <w:t xml:space="preserve">Attention Is All You Need</w:t>
+      </w:r>
+      <w:r>
+        <w:t xml:space="preserve">”</w:t>
+      </w:r>
+      <w:r>
+        <w:t xml:space="preserve">. Transformer meninggalkan pemrosesan sekuensial kata demi kata sebagaimana pada RNN/LSTM, dan menggantinya dengan mekanisme self-attention, yaitu mekanisme yang memungkinkan model menimbang relasi antara setiap kata dengan seluruh kata lain dalam kalimat secara simultan dan paralel, terlepas dari jaraknya dalam kalimat.</w:t>
+      </w:r>
+    </w:p>
+    <w:p>
+      <w:pPr>
+        <w:pStyle w:val="BodyText"/>
+      </w:pPr>
+      <w:r>
+        <w:t xml:space="preserve">Mekanisme self-attention bekerja dengan menghitung skor kepentingan (attention weight) antara setiap pasangan kata dalam sebuah kalimat, sehingga model dapat</w:t>
+      </w:r>
+      <w:r>
+        <w:t xml:space="preserve"> </w:t>
+      </w:r>
+      <w:r>
+        <w:t xml:space="preserve">“</w:t>
+      </w:r>
+      <w:r>
+        <w:t xml:space="preserve">memahami</w:t>
+      </w:r>
+      <w:r>
+        <w:t xml:space="preserve">”</w:t>
+      </w:r>
+      <w:r>
+        <w:t xml:space="preserve"> </w:t>
+      </w:r>
+      <w:r>
+        <w:t xml:space="preserve">bahwa kata tertentu memiliki relevansi tinggi terhadap kata lain yang letaknya jauh, sebuah kemampuan yang sangat relevan untuk menangkap struktur kalimat panjang dan kompleks, termasuk kalimat yang mengandung klausa bertingkat seperti pada contoh cuitan bernada sindiran di Tabel 1.1 Bab I, di mana makna sesungguhnya baru terungkap setelah membaca keseluruhan kalimat hingga klausa penutup dan emoji yang menyertainya.</w:t>
       </w:r>
     </w:p>
     <w:p>
@@ -3594,54 +3595,21 @@
           <w:bCs/>
           <w:b/>
         </w:rPr>
-        <w:t xml:space="preserve">2.5.2 Arsitektur Transformer dan Mekanisme Self-Attention.</w:t>
-      </w:r>
-      <w:r>
-        <w:t xml:space="preserve"> </w:t>
-      </w:r>
-      <w:r>
-        <w:t xml:space="preserve">Generasi ketiga, yang menjadi fondasi model yang digunakan dalam penelitian ini, dimulai dengan diperkenalkannya arsitektur Transformer oleh Vaswani dkk. (2017) melalui makalah berjudul</w:t>
-      </w:r>
-      <w:r>
-        <w:t xml:space="preserve"> </w:t>
-      </w:r>
-      <w:r>
-        <w:t xml:space="preserve">“</w:t>
-      </w:r>
-      <w:r>
-        <w:t xml:space="preserve">Attention Is All You Need</w:t>
-      </w:r>
-      <w:r>
-        <w:t xml:space="preserve">”</w:t>
-      </w:r>
-      <w:r>
-        <w:t xml:space="preserve">. Transformer meninggalkan pemrosesan sekuensial kata demi kata sebagaimana pada RNN/LSTM, dan menggantinya dengan mekanisme self-attention, yaitu mekanisme yang memungkinkan model menimbang relasi antara setiap kata dengan seluruh kata lain dalam kalimat secara simultan dan paralel, terlepas dari jaraknya dalam kalimat.</w:t>
-      </w:r>
-    </w:p>
-    <w:p>
-      <w:pPr>
-        <w:pStyle w:val="BodyText"/>
-      </w:pPr>
-      <w:r>
-        <w:t xml:space="preserve">Mekanisme self-attention bekerja dengan menghitung skor kepentingan (attention weight) antara setiap pasangan kata dalam sebuah kalimat, sehingga model dapat</w:t>
-      </w:r>
-      <w:r>
-        <w:t xml:space="preserve"> </w:t>
-      </w:r>
-      <w:r>
-        <w:t xml:space="preserve">“</w:t>
-      </w:r>
-      <w:r>
-        <w:t xml:space="preserve">memahami</w:t>
-      </w:r>
-      <w:r>
-        <w:t xml:space="preserve">”</w:t>
-      </w:r>
-      <w:r>
-        <w:t xml:space="preserve"> </w:t>
-      </w:r>
-      <w:r>
-        <w:t xml:space="preserve">bahwa kata tertentu memiliki relevansi tinggi terhadap kata lain yang letaknya jauh, sebuah kemampuan yang sangat relevan untuk menangkap struktur kalimat panjang dan kompleks, termasuk kalimat yang mengandung klausa bertingkat seperti pada contoh cuitan bernada sindiran di Tabel 1.1 Bab I, di mana makna sesungguhnya baru terungkap setelah membaca keseluruhan kalimat hingga klausa penutup dan emoji yang menyertainya.</w:t>
+        <w:t xml:space="preserve">2.5.3 BERT: Bidirectional Encoder Representations from Transformers.</w:t>
+      </w:r>
+      <w:r>
+        <w:t xml:space="preserve"> </w:t>
+      </w:r>
+      <w:r>
+        <w:t xml:space="preserve">Devlin, Chang, Lee, dan Toutanova (2018) mengembangkan BERT (Bidirectional Encoder Representations from Transformers) sebagai model bahasa yang memanfaatkan arsitektur Transformer secara dua arah (bidirectional), berbeda dari model bahasa generasi sebelumnya yang umumnya memproses teks secara satu arah (dari kiri ke kanan atau sebaliknya). Sifat dua arah ini memungkinkan BERT memahami makna sebuah kata berdasarkan konteks yang muncul baik sebelum maupun sesudah kata tersebut dalam kalimat, sehingga representasi makna yang dihasilkan jauh lebih kaya konteks dibandingkan model satu arah.</w:t>
+      </w:r>
+    </w:p>
+    <w:p>
+      <w:pPr>
+        <w:pStyle w:val="BodyText"/>
+      </w:pPr>
+      <w:r>
+        <w:t xml:space="preserve">BERT dilatih melalui dua tugas pralatih (pretraining task) utama: pertama, Masked Language Modeling, yaitu memprediksi kata yang sengaja disembunyikan dalam sebuah kalimat berdasarkan konteks kata-kata di sekitarnya; kedua, Next Sentence Prediction, yaitu memprediksi apakah dua kalimat yang diberikan secara berurutan memang saling berkaitan secara logis. Kombinasi kedua tugas ini memungkinkan BERT membangun representasi bahasa yang kaya sebelum kemudian di-fine-tune untuk tugas spesifik seperti klasifikasi sentimen atau klasifikasi emosi, sebagaimana dilakukan dalam penelitian ini (Chiorrini dkk., 2021).</w:t>
       </w:r>
     </w:p>
     <w:p>
@@ -3653,21 +3621,21 @@
           <w:bCs/>
           <w:b/>
         </w:rPr>
-        <w:t xml:space="preserve">2.5.3 BERT: Bidirectional Encoder Representations from Transformers.</w:t>
-      </w:r>
-      <w:r>
-        <w:t xml:space="preserve"> </w:t>
-      </w:r>
-      <w:r>
-        <w:t xml:space="preserve">Devlin, Chang, Lee, dan Toutanova (2018) mengembangkan BERT (Bidirectional Encoder Representations from Transformers) sebagai model bahasa yang memanfaatkan arsitektur Transformer secara dua arah (bidirectional), berbeda dari model bahasa generasi sebelumnya yang umumnya memproses teks secara satu arah (dari kiri ke kanan atau sebaliknya). Sifat dua arah ini memungkinkan BERT memahami makna sebuah kata berdasarkan konteks yang muncul baik sebelum maupun sesudah kata tersebut dalam kalimat, sehingga representasi makna yang dihasilkan jauh lebih kaya konteks dibandingkan model satu arah.</w:t>
-      </w:r>
-    </w:p>
-    <w:p>
-      <w:pPr>
-        <w:pStyle w:val="BodyText"/>
-      </w:pPr>
-      <w:r>
-        <w:t xml:space="preserve">BERT dilatih melalui dua tugas pralatih (pretraining task) utama: pertama, Masked Language Modeling, yaitu memprediksi kata yang sengaja disembunyikan dalam sebuah kalimat berdasarkan konteks kata-kata di sekitarnya; kedua, Next Sentence Prediction, yaitu memprediksi apakah dua kalimat yang diberikan secara berurutan memang saling berkaitan secara logis. Kombinasi kedua tugas ini memungkinkan BERT membangun representasi bahasa yang kaya sebelum kemudian di-fine-tune untuk tugas spesifik seperti klasifikasi sentimen atau klasifikasi emosi, sebagaimana dilakukan dalam penelitian ini (Chiorrini dkk., 2021).</w:t>
+        <w:t xml:space="preserve">2.5.4 IndoBERT: Adaptasi Model Bahasa untuk Konteks Indonesia.</w:t>
+      </w:r>
+      <w:r>
+        <w:t xml:space="preserve"> </w:t>
+      </w:r>
+      <w:r>
+        <w:t xml:space="preserve">Meski BERT terbukti unggul pada korpus berbahasa Inggris, penerapannya secara langsung pada teks berbahasa Indonesia menghadapi kendala mendasar, sebab BERT versi asli dilatih pada korpus berbahasa Inggris dengan kosakata (vocabulary) dan pola morfologis yang sangat berbeda dari bahasa Indonesia. Bahasa Indonesia memiliki karakteristik morfologis aglutinatif (imbuhan yang menempel pada kata dasar), penggunaan kata serapan campuran dari berbagai bahasa daerah dan bahasa asing, serta ragam bahasa gaul dan singkatan khas media sosial yang berkembang sangat cepat dan tidak baku.</w:t>
+      </w:r>
+    </w:p>
+    <w:p>
+      <w:pPr>
+        <w:pStyle w:val="BodyText"/>
+      </w:pPr>
+      <w:r>
+        <w:t xml:space="preserve">Untuk menjawab kebutuhan ini, Wilie dkk. (2020) mengembangkan IndoBERT, yaitu model BERT yang dilatih dari awal (pretrained from scratch) menggunakan korpus besar berbahasa Indonesia yang mencakup teks berita, Wikipedia, dan berbagai sumber teks daring lainnya. Dengan proses pralatih yang khusus disesuaikan pada korpus bahasa Indonesia, IndoBERT memiliki kemampuan yang jauh lebih baik dalam memahami nuansa morfologis dan leksikal bahasa Indonesia dibandingkan model BERT multibahasa (multilingual BERT) yang dilatih secara umum pada campuran banyak bahasa sekaligus tanpa penyesuaian khusus.</w:t>
       </w:r>
     </w:p>
     <w:p>
@@ -3679,21 +3647,75 @@
           <w:bCs/>
           <w:b/>
         </w:rPr>
-        <w:t xml:space="preserve">2.5.4 IndoBERT: Adaptasi Model Bahasa untuk Konteks Indonesia.</w:t>
-      </w:r>
-      <w:r>
-        <w:t xml:space="preserve"> </w:t>
-      </w:r>
-      <w:r>
-        <w:t xml:space="preserve">Meski BERT terbukti unggul pada korpus berbahasa Inggris, penerapannya secara langsung pada teks berbahasa Indonesia menghadapi kendala mendasar, sebab BERT versi asli dilatih pada korpus berbahasa Inggris dengan kosakata (vocabulary) dan pola morfologis yang sangat berbeda dari bahasa Indonesia. Bahasa Indonesia memiliki karakteristik morfologis aglutinatif (imbuhan yang menempel pada kata dasar), penggunaan kata serapan campuran dari berbagai bahasa daerah dan bahasa asing, serta ragam bahasa gaul dan singkatan khas media sosial yang berkembang sangat cepat dan tidak baku.</w:t>
-      </w:r>
-    </w:p>
-    <w:p>
-      <w:pPr>
-        <w:pStyle w:val="BodyText"/>
-      </w:pPr>
-      <w:r>
-        <w:t xml:space="preserve">Untuk menjawab kebutuhan ini, Wilie dkk. (2020) mengembangkan IndoBERT, yaitu model BERT yang dilatih dari awal (pretrained from scratch) menggunakan korpus besar berbahasa Indonesia yang mencakup teks berita, Wikipedia, dan berbagai sumber teks daring lainnya. Dengan proses pralatih yang khusus disesuaikan pada korpus bahasa Indonesia, IndoBERT memiliki kemampuan yang jauh lebih baik dalam memahami nuansa morfologis dan leksikal bahasa Indonesia dibandingkan model BERT multibahasa (multilingual BERT) yang dilatih secara umum pada campuran banyak bahasa sekaligus tanpa penyesuaian khusus.</w:t>
+        <w:t xml:space="preserve">2.5.5 Fine-Tuning IndoBERT untuk Klasifikasi Emosi Granular.</w:t>
+      </w:r>
+      <w:r>
+        <w:t xml:space="preserve"> </w:t>
+      </w:r>
+      <w:r>
+        <w:t xml:space="preserve">Dalam penelitian ini, model dasar IndoBERT akan mengalami proses fine-tuning, yaitu proses pelatihan lanjutan pada dataset spesifik (cuitan mengenai Program MBG yang telah diberi label emosi) agar model dapat menyesuaikan representasi bahasanya yang bersifat umum menjadi representasi yang spesifik untuk tugas klasifikasi sembilan kelas emosi: marah, bahagia, sedih, tertarik, takut, netral, percaya, jijik, dan kaget. Proses fine-tuning ini melibatkan penambahan lapisan klasifikasi (classification head) di atas representasi keluaran IndoBERT, yang kemudian dilatih menggunakan data berlabel melalui algoritma optimisasi berbasis backpropagation.</w:t>
+      </w:r>
+    </w:p>
+    <w:p>
+      <w:pPr>
+        <w:pStyle w:val="BodyText"/>
+      </w:pPr>
+      <w:r>
+        <w:t xml:space="preserve">Pemilihan skema sembilan kelas emosi ini merujuk pada model emosi dasar Plutchik (1980), yang mengidentifikasi delapan emosi primer manusia (termasuk kombinasi dan intensitasnya), yang kemudian diadaptasi dan diperluas dalam konteks penelitian ini dengan menambahkan kategori</w:t>
+      </w:r>
+      <w:r>
+        <w:t xml:space="preserve"> </w:t>
+      </w:r>
+      <w:r>
+        <w:t xml:space="preserve">“</w:t>
+      </w:r>
+      <w:r>
+        <w:t xml:space="preserve">percaya</w:t>
+      </w:r>
+      <w:r>
+        <w:t xml:space="preserve">”</w:t>
+      </w:r>
+      <w:r>
+        <w:t xml:space="preserve"> </w:t>
+      </w:r>
+      <w:r>
+        <w:t xml:space="preserve">sebagai respons afektif yang relevan secara spesifik dalam konteks kepercayaan publik terhadap kebijakan negara. Dengan skema klasifikasi granular semacam ini, model diharapkan mampu menangkap nuansa emosi campuran yang lazim muncul dalam wacana kebijakan publik, sebagaimana dijelaskan pada Bab I bahwa seorang warganet dapat merasa</w:t>
+      </w:r>
+      <w:r>
+        <w:t xml:space="preserve"> </w:t>
+      </w:r>
+      <w:r>
+        <w:t xml:space="preserve">“</w:t>
+      </w:r>
+      <w:r>
+        <w:t xml:space="preserve">percaya</w:t>
+      </w:r>
+      <w:r>
+        <w:t xml:space="preserve">”</w:t>
+      </w:r>
+      <w:r>
+        <w:t xml:space="preserve"> </w:t>
+      </w:r>
+      <w:r>
+        <w:t xml:space="preserve">pada visi besar kebijakan sekaligus</w:t>
+      </w:r>
+      <w:r>
+        <w:t xml:space="preserve"> </w:t>
+      </w:r>
+      <w:r>
+        <w:t xml:space="preserve">“</w:t>
+      </w:r>
+      <w:r>
+        <w:t xml:space="preserve">takut</w:t>
+      </w:r>
+      <w:r>
+        <w:t xml:space="preserve">”</w:t>
+      </w:r>
+      <w:r>
+        <w:t xml:space="preserve"> </w:t>
+      </w:r>
+      <w:r>
+        <w:t xml:space="preserve">akan konsekuensi fiskalnya secara bersamaan.</w:t>
       </w:r>
     </w:p>
     <w:p>
@@ -3705,21 +3727,13 @@
           <w:bCs/>
           <w:b/>
         </w:rPr>
-        <w:t xml:space="preserve">2.5.5 Fine-Tuning IndoBERT untuk Klasifikasi Emosi Granular.</w:t>
-      </w:r>
-      <w:r>
-        <w:t xml:space="preserve"> </w:t>
-      </w:r>
-      <w:r>
-        <w:t xml:space="preserve">Dalam penelitian ini, model dasar IndoBERT akan mengalami proses fine-tuning, yaitu proses pelatihan lanjutan pada dataset spesifik (cuitan mengenai Program MBG yang telah diberi label emosi) agar model dapat menyesuaikan representasi bahasanya yang bersifat umum menjadi representasi yang spesifik untuk tugas klasifikasi sembilan kelas emosi: marah, bahagia, sedih, tertarik, takut, netral, percaya, jijik, dan kaget. Proses fine-tuning ini melibatkan penambahan lapisan klasifikasi (classification head) di atas representasi keluaran IndoBERT, yang kemudian dilatih menggunakan data berlabel melalui algoritma optimisasi berbasis backpropagation.</w:t>
-      </w:r>
-    </w:p>
-    <w:p>
-      <w:pPr>
-        <w:pStyle w:val="BodyText"/>
-      </w:pPr>
-      <w:r>
-        <w:t xml:space="preserve">Pemilihan skema sembilan kelas emosi ini merujuk pada model emosi dasar Plutchik (1980), yang mengidentifikasi delapan emosi primer manusia (termasuk kombinasi dan intensitasnya), yang kemudian diadaptasi dan diperluas dalam konteks penelitian ini dengan menambahkan kategori</w:t>
+        <w:t xml:space="preserve">2.5.6 Evaluasi Kinerja Model: Akurasi, Presisi, Recall, dan F1-Score.</w:t>
+      </w:r>
+      <w:r>
+        <w:t xml:space="preserve"> </w:t>
+      </w:r>
+      <w:r>
+        <w:t xml:space="preserve">Klaim keunggulan sebuah model klasifikasi tidak dapat diterima begitu saja tanpa evaluasi kinerja yang sistematis. Sokolova dan Lapalme (2009) menegaskan bahwa akurasi (accuracy), yang mengukur proporsi prediksi benar dari keseluruhan data uji, merupakan metrik yang paling intuitif namun juga paling rentan menyesatkan, terutama pada dataset dengan distribusi kelas yang tidak seimbang (imbalanced), sebuah kondisi yang lazim terjadi pada data emosi cuitan warganet, sebab emosi tertentu (misalnya</w:t>
       </w:r>
       <w:r>
         <w:t xml:space="preserve"> </w:t>
@@ -3728,7 +3742,7 @@
         <w:t xml:space="preserve">“</w:t>
       </w:r>
       <w:r>
-        <w:t xml:space="preserve">percaya</w:t>
+        <w:t xml:space="preserve">kaget</w:t>
       </w:r>
       <w:r>
         <w:t xml:space="preserve">”</w:t>
@@ -3737,7 +3751,7 @@
         <w:t xml:space="preserve"> </w:t>
       </w:r>
       <w:r>
-        <w:t xml:space="preserve">sebagai respons afektif yang relevan secara spesifik dalam konteks kepercayaan publik terhadap kebijakan negara. Dengan skema klasifikasi granular semacam ini, model diharapkan mampu menangkap nuansa emosi campuran yang lazim muncul dalam wacana kebijakan publik, sebagaimana dijelaskan pada Bab I bahwa seorang warganet dapat merasa</w:t>
+        <w:t xml:space="preserve">atau</w:t>
       </w:r>
       <w:r>
         <w:t xml:space="preserve"> </w:t>
@@ -3746,16 +3760,13 @@
         <w:t xml:space="preserve">“</w:t>
       </w:r>
       <w:r>
-        <w:t xml:space="preserve">percaya</w:t>
+        <w:t xml:space="preserve">jijik</w:t>
       </w:r>
       <w:r>
         <w:t xml:space="preserve">”</w:t>
       </w:r>
       <w:r>
-        <w:t xml:space="preserve"> </w:t>
-      </w:r>
-      <w:r>
-        <w:t xml:space="preserve">pada visi besar kebijakan sekaligus</w:t>
+        <w:t xml:space="preserve">) secara alami muncul jauh lebih jarang dibandingkan emosi lain (misalnya</w:t>
       </w:r>
       <w:r>
         <w:t xml:space="preserve"> </w:t>
@@ -3764,7 +3775,7 @@
         <w:t xml:space="preserve">“</w:t>
       </w:r>
       <w:r>
-        <w:t xml:space="preserve">takut</w:t>
+        <w:t xml:space="preserve">marah</w:t>
       </w:r>
       <w:r>
         <w:t xml:space="preserve">”</w:t>
@@ -3773,7 +3784,63 @@
         <w:t xml:space="preserve"> </w:t>
       </w:r>
       <w:r>
-        <w:t xml:space="preserve">akan konsekuensi fiskalnya secara bersamaan.</w:t>
+        <w:t xml:space="preserve">atau</w:t>
+      </w:r>
+      <w:r>
+        <w:t xml:space="preserve"> </w:t>
+      </w:r>
+      <w:r>
+        <w:t xml:space="preserve">“</w:t>
+      </w:r>
+      <w:r>
+        <w:t xml:space="preserve">netral</w:t>
+      </w:r>
+      <w:r>
+        <w:t xml:space="preserve">”</w:t>
+      </w:r>
+      <w:r>
+        <w:t xml:space="preserve">).</w:t>
+      </w:r>
+    </w:p>
+    <w:p>
+      <w:pPr>
+        <w:pStyle w:val="BodyText"/>
+      </w:pPr>
+      <w:r>
+        <w:t xml:space="preserve">Oleh karena itu, penelitian ini akan melengkapi metrik akurasi dengan metrik presisi (precision), yang mengukur proporsi prediksi positif suatu kelas yang benar-benar tepat, dan recall, yang mengukur proporsi data aktual suatu kelas yang berhasil terdeteksi oleh model. Kedua metrik ini kemudian dirangkum melalui F1-score, yaitu rata-rata harmonik antara presisi dan recall, yang memberikan gambaran kinerja model yang lebih seimbang, terutama pada kelas-kelas minoritas. Evaluasi menyeluruh menggunakan confusion matrix per kelas emosi juga akan digunakan untuk mengidentifikasi pola kesalahan klasifikasi yang sistematis, misalnya kecenderungan model mengelirukan emosi</w:t>
+      </w:r>
+      <w:r>
+        <w:t xml:space="preserve"> </w:t>
+      </w:r>
+      <w:r>
+        <w:t xml:space="preserve">“</w:t>
+      </w:r>
+      <w:r>
+        <w:t xml:space="preserve">jijik</w:t>
+      </w:r>
+      <w:r>
+        <w:t xml:space="preserve">”</w:t>
+      </w:r>
+      <w:r>
+        <w:t xml:space="preserve"> </w:t>
+      </w:r>
+      <w:r>
+        <w:t xml:space="preserve">dengan</w:t>
+      </w:r>
+      <w:r>
+        <w:t xml:space="preserve"> </w:t>
+      </w:r>
+      <w:r>
+        <w:t xml:space="preserve">“</w:t>
+      </w:r>
+      <w:r>
+        <w:t xml:space="preserve">marah</w:t>
+      </w:r>
+      <w:r>
+        <w:t xml:space="preserve">”</w:t>
+      </w:r>
+      <w:r>
+        <w:t xml:space="preserve">, yang keduanya sama-sama sering muncul pada konteks kritik terhadap higienitas makanan program MBG. Dengan pendekatan evaluasi yang menyeluruh ini, klaim performa model pada Bab IV akan dipertanggungjawabkan secara metodologis, bukan sekadar disajikan sebagai angka akurasi pelatihan tunggal.</w:t>
       </w:r>
     </w:p>
     <w:p>
@@ -3785,120 +3852,21 @@
           <w:bCs/>
           <w:b/>
         </w:rPr>
-        <w:t xml:space="preserve">2.5.6 Evaluasi Kinerja Model: Akurasi, Presisi, Recall, dan F1-Score.</w:t>
-      </w:r>
-      <w:r>
-        <w:t xml:space="preserve"> </w:t>
-      </w:r>
-      <w:r>
-        <w:t xml:space="preserve">Klaim keunggulan sebuah model klasifikasi tidak dapat diterima begitu saja tanpa evaluasi kinerja yang sistematis. Sokolova dan Lapalme (2009) menegaskan bahwa akurasi (accuracy), yang mengukur proporsi prediksi benar dari keseluruhan data uji, merupakan metrik yang paling intuitif namun juga paling rentan menyesatkan, terutama pada dataset dengan distribusi kelas yang tidak seimbang (imbalanced), sebuah kondisi yang lazim terjadi pada data emosi cuitan warganet, sebab emosi tertentu (misalnya</w:t>
-      </w:r>
-      <w:r>
-        <w:t xml:space="preserve"> </w:t>
-      </w:r>
-      <w:r>
-        <w:t xml:space="preserve">“</w:t>
-      </w:r>
-      <w:r>
-        <w:t xml:space="preserve">kaget</w:t>
-      </w:r>
-      <w:r>
-        <w:t xml:space="preserve">”</w:t>
-      </w:r>
-      <w:r>
-        <w:t xml:space="preserve"> </w:t>
-      </w:r>
-      <w:r>
-        <w:t xml:space="preserve">atau</w:t>
-      </w:r>
-      <w:r>
-        <w:t xml:space="preserve"> </w:t>
-      </w:r>
-      <w:r>
-        <w:t xml:space="preserve">“</w:t>
-      </w:r>
-      <w:r>
-        <w:t xml:space="preserve">jijik</w:t>
-      </w:r>
-      <w:r>
-        <w:t xml:space="preserve">”</w:t>
-      </w:r>
-      <w:r>
-        <w:t xml:space="preserve">) secara alami muncul jauh lebih jarang dibandingkan emosi lain (misalnya</w:t>
-      </w:r>
-      <w:r>
-        <w:t xml:space="preserve"> </w:t>
-      </w:r>
-      <w:r>
-        <w:t xml:space="preserve">“</w:t>
-      </w:r>
-      <w:r>
-        <w:t xml:space="preserve">marah</w:t>
-      </w:r>
-      <w:r>
-        <w:t xml:space="preserve">”</w:t>
-      </w:r>
-      <w:r>
-        <w:t xml:space="preserve"> </w:t>
-      </w:r>
-      <w:r>
-        <w:t xml:space="preserve">atau</w:t>
-      </w:r>
-      <w:r>
-        <w:t xml:space="preserve"> </w:t>
-      </w:r>
-      <w:r>
-        <w:t xml:space="preserve">“</w:t>
-      </w:r>
-      <w:r>
-        <w:t xml:space="preserve">netral</w:t>
-      </w:r>
-      <w:r>
-        <w:t xml:space="preserve">”</w:t>
-      </w:r>
-      <w:r>
-        <w:t xml:space="preserve">).</w:t>
-      </w:r>
-    </w:p>
-    <w:p>
-      <w:pPr>
-        <w:pStyle w:val="BodyText"/>
-      </w:pPr>
-      <w:r>
-        <w:t xml:space="preserve">Oleh karena itu, penelitian ini akan melengkapi metrik akurasi dengan metrik presisi (precision), yang mengukur proporsi prediksi positif suatu kelas yang benar-benar tepat, dan recall, yang mengukur proporsi data aktual suatu kelas yang berhasil terdeteksi oleh model. Kedua metrik ini kemudian dirangkum melalui F1-score, yaitu rata-rata harmonik antara presisi dan recall, yang memberikan gambaran kinerja model yang lebih seimbang, terutama pada kelas-kelas minoritas. Evaluasi menyeluruh menggunakan confusion matrix per kelas emosi juga akan digunakan untuk mengidentifikasi pola kesalahan klasifikasi yang sistematis, misalnya kecenderungan model mengelirukan emosi</w:t>
-      </w:r>
-      <w:r>
-        <w:t xml:space="preserve"> </w:t>
-      </w:r>
-      <w:r>
-        <w:t xml:space="preserve">“</w:t>
-      </w:r>
-      <w:r>
-        <w:t xml:space="preserve">jijik</w:t>
-      </w:r>
-      <w:r>
-        <w:t xml:space="preserve">”</w:t>
-      </w:r>
-      <w:r>
-        <w:t xml:space="preserve"> </w:t>
-      </w:r>
-      <w:r>
-        <w:t xml:space="preserve">dengan</w:t>
-      </w:r>
-      <w:r>
-        <w:t xml:space="preserve"> </w:t>
-      </w:r>
-      <w:r>
-        <w:t xml:space="preserve">“</w:t>
-      </w:r>
-      <w:r>
-        <w:t xml:space="preserve">marah</w:t>
-      </w:r>
-      <w:r>
-        <w:t xml:space="preserve">”</w:t>
-      </w:r>
-      <w:r>
-        <w:t xml:space="preserve">, yang keduanya sama-sama sering muncul pada konteks kritik terhadap higienitas makanan program MBG. Dengan pendekatan evaluasi yang menyeluruh ini, klaim performa model pada Bab IV akan dipertanggungjawabkan secara metodologis, bukan sekadar disajikan sebagai angka akurasi pelatihan tunggal.</w:t>
+        <w:t xml:space="preserve">2.5.7 Isu Bias dan Ketidakseimbangan Data pada Model Bahasa.</w:t>
+      </w:r>
+      <w:r>
+        <w:t xml:space="preserve"> </w:t>
+      </w:r>
+      <w:r>
+        <w:t xml:space="preserve">Kajian kritis mengenai model bahasa berbasis deep learning juga perlu memperhitungkan potensi bias yang terkandung dalam data pralatih maupun data fine-tuning. Bender, Gebru, McMillan-Major, dan Shmitchell (2021) mengingatkan bahwa model bahasa berskala besar, betapapun canggih arsitekturnya, senantiasa mewarisi bias yang terkandung dalam korpus pelatihannya, termasuk bias terhadap ragam bahasa tertentu, kelompok demografis tertentu, atau sudut pandang politik tertentu yang secara tidak proporsional lebih banyak terwakili dalam data.</w:t>
+      </w:r>
+    </w:p>
+    <w:p>
+      <w:pPr>
+        <w:pStyle w:val="BodyText"/>
+      </w:pPr>
+      <w:r>
+        <w:t xml:space="preserve">Dalam konteks penelitian ini, potensi bias tersebut relevan diperhatikan pada dua titik. Pertama, korpus pralatih IndoBERT yang didominasi teks berita dan Wikipedia mungkin kurang merepresentasikan ragam bahasa gaul dan sindiran khas media sosial, sehingga proses fine-tuning pada data spesifik MBG menjadi krusial untuk menutup kesenjangan tersebut. Kedua, proses pelabelan data latih yang dilakukan secara manual oleh anotator manusia berpotensi mengandung bias subjektif anotator dalam menafsirkan sindiran, yang secara inheren merupakan fenomena bahasa yang tidak selalu memiliki interpretasi tunggal yang disepakati semua orang. Untuk memitigasi risiko ini, penelitian akan menerapkan prosedur anotasi ganda (multiple annotators) dan pengukuran kesepakatan antarpenilai (inter-annotator agreement) menggunakan statistik Cohen’s Kappa (Cohen, 1960), sebagaimana akan dijelaskan lebih rinci pada teknik pengumpulan data di Bab III.</w:t>
       </w:r>
     </w:p>
     <w:p>
@@ -3910,83 +3878,83 @@
           <w:bCs/>
           <w:b/>
         </w:rPr>
-        <w:t xml:space="preserve">2.5.7 Isu Bias dan Ketidakseimbangan Data pada Model Bahasa.</w:t>
-      </w:r>
-      <w:r>
-        <w:t xml:space="preserve"> </w:t>
-      </w:r>
-      <w:r>
-        <w:t xml:space="preserve">Kajian kritis mengenai model bahasa berbasis deep learning juga perlu memperhitungkan potensi bias yang terkandung dalam data pralatih maupun data fine-tuning. Bender, Gebru, McMillan-Major, dan Shmitchell (2021) mengingatkan bahwa model bahasa berskala besar, betapapun canggih arsitekturnya, senantiasa mewarisi bias yang terkandung dalam korpus pelatihannya, termasuk bias terhadap ragam bahasa tertentu, kelompok demografis tertentu, atau sudut pandang politik tertentu yang secara tidak proporsional lebih banyak terwakili dalam data.</w:t>
-      </w:r>
-    </w:p>
-    <w:p>
-      <w:pPr>
-        <w:pStyle w:val="BodyText"/>
-      </w:pPr>
-      <w:r>
-        <w:t xml:space="preserve">Dalam konteks penelitian ini, potensi bias tersebut relevan diperhatikan pada dua titik. Pertama, korpus pralatih IndoBERT yang didominasi teks berita dan Wikipedia mungkin kurang merepresentasikan ragam bahasa gaul dan sindiran khas media sosial, sehingga proses fine-tuning pada data spesifik MBG menjadi krusial untuk menutup kesenjangan tersebut. Kedua, proses pelabelan data latih yang dilakukan secara manual oleh anotator manusia berpotensi mengandung bias subjektif anotator dalam menafsirkan sindiran, yang secara inheren merupakan fenomena bahasa yang tidak selalu memiliki interpretasi tunggal yang disepakati semua orang. Untuk memitigasi risiko ini, penelitian akan menerapkan prosedur anotasi ganda (multiple annotators) dan pengukuran kesepakatan antarpenilai (inter-annotator agreement) menggunakan statistik Cohen’s Kappa (Cohen, 1960), sebagaimana akan dijelaskan lebih rinci pada teknik pengumpulan data di Bab III.</w:t>
-      </w:r>
-    </w:p>
-    <w:p>
-      <w:pPr>
-        <w:pStyle w:val="BodyText"/>
+        <w:t xml:space="preserve">2.5.8 Perbandingan IndoBERT dengan Model Bahasa Alternatif.</w:t>
+      </w:r>
+      <w:r>
+        <w:t xml:space="preserve"> </w:t>
+      </w:r>
+      <w:r>
+        <w:t xml:space="preserve">Pemilihan IndoBERT sebagai model utama penelitian ini juga perlu dipertimbangkan di antara sejumlah alternatif model bahasa berbahasa Indonesia yang telah dikembangkan oleh komunitas riset. Selain IndoBERT (Wilie dkk., 2020), terdapat pula model IndoBERTweet (Koto, Lau, &amp; Baldwin, 2021), yang secara spesifik dilatih pada korpus cuitan berbahasa Indonesia, sehingga secara teoretis lebih adaptif terhadap ragam bahasa media sosial dibandingkan IndoBERT yang dilatih pada korpus berita dan Wikipedia yang lebih formal.</w:t>
+      </w:r>
+    </w:p>
+    <w:p>
+      <w:pPr>
+        <w:pStyle w:val="BodyText"/>
+      </w:pPr>
+      <w:r>
+        <w:t xml:space="preserve">Sekalipun IndoBERTweet menawarkan keunggulan spesifik untuk domain media sosial, penelitian ini tetap mempertimbangkan IndoBERT versi umum sebagai basis utama dengan alasan ketersediaan dokumentasi, dukungan komunitas riset yang lebih luas, dan fleksibilitas fine-tuning untuk berbagai tugas klasifikasi (baik emosi granular maupun ABSA) yang telah terbukti pada berbagai studi rujukan. Namun demikian, penelitian ini tetap membuka kemungkinan melakukan uji banding (benchmarking) singkat antara performa IndoBERT dan IndoBERTweet pada subset data MBG selama tahap awal eksperimen di Bab III, guna memastikan pilihan model akhir didasarkan pada bukti empiris performa pada domain data penelitian ini, bukan semata pada popularitas model di literatur.</w:t>
+      </w:r>
+    </w:p>
+    <w:bookmarkEnd w:id="41"/>
+    <w:bookmarkStart w:id="42" w:name="teori-graf-dan-social-network-analysis"/>
+    <w:p>
+      <w:pPr>
+        <w:pStyle w:val="Heading2"/>
+      </w:pPr>
+      <w:r>
+        <w:t xml:space="preserve">2.6 Teori Graf dan Social Network Analysis</w:t>
+      </w:r>
+    </w:p>
+    <w:p>
+      <w:pPr>
+        <w:pStyle w:val="FirstParagraph"/>
       </w:pPr>
       <w:r>
         <w:rPr>
           <w:bCs/>
           <w:b/>
         </w:rPr>
-        <w:t xml:space="preserve">2.5.8 Perbandingan IndoBERT dengan Model Bahasa Alternatif.</w:t>
-      </w:r>
-      <w:r>
-        <w:t xml:space="preserve"> </w:t>
-      </w:r>
-      <w:r>
-        <w:t xml:space="preserve">Pemilihan IndoBERT sebagai model utama penelitian ini juga perlu dipertimbangkan di antara sejumlah alternatif model bahasa berbahasa Indonesia yang telah dikembangkan oleh komunitas riset. Selain IndoBERT (Wilie dkk., 2020), terdapat pula model IndoBERTweet (Koto, Lau, &amp; Baldwin, 2021), yang secara spesifik dilatih pada korpus cuitan berbahasa Indonesia, sehingga secara teoretis lebih adaptif terhadap ragam bahasa media sosial dibandingkan IndoBERT yang dilatih pada korpus berita dan Wikipedia yang lebih formal.</w:t>
-      </w:r>
-    </w:p>
-    <w:p>
-      <w:pPr>
-        <w:pStyle w:val="BodyText"/>
-      </w:pPr>
-      <w:r>
-        <w:t xml:space="preserve">Sekalipun IndoBERTweet menawarkan keunggulan spesifik untuk domain media sosial, penelitian ini tetap mempertimbangkan IndoBERT versi umum sebagai basis utama dengan alasan ketersediaan dokumentasi, dukungan komunitas riset yang lebih luas, dan fleksibilitas fine-tuning untuk berbagai tugas klasifikasi (baik emosi granular maupun ABSA) yang telah terbukti pada berbagai studi rujukan. Namun demikian, penelitian ini tetap membuka kemungkinan melakukan uji banding (benchmarking) singkat antara performa IndoBERT dan IndoBERTweet pada subset data MBG selama tahap awal eksperimen di Bab III, guna memastikan pilihan model akhir didasarkan pada bukti empiris performa pada domain data penelitian ini, bukan semata pada popularitas model di literatur.</w:t>
-      </w:r>
-    </w:p>
-    <w:bookmarkEnd w:id="41"/>
-    <w:bookmarkStart w:id="42" w:name="teori-graf-dan-social-network-analysis"/>
-    <w:p>
-      <w:pPr>
-        <w:pStyle w:val="Heading2"/>
-      </w:pPr>
-      <w:r>
-        <w:t xml:space="preserve">2.6 Teori Graf dan Social Network Analysis</w:t>
-      </w:r>
-    </w:p>
-    <w:p>
-      <w:pPr>
-        <w:pStyle w:val="FirstParagraph"/>
+        <w:t xml:space="preserve">2.6.1 Dasar-Dasar Teori Graf.</w:t>
+      </w:r>
+      <w:r>
+        <w:t xml:space="preserve"> </w:t>
+      </w:r>
+      <w:r>
+        <w:t xml:space="preserve">Social Network Analysis (SNA) berakar dari cabang matematika yang disebut teori graf (graph theory), yang pertama kali dirumuskan secara formal oleh Leonhard Euler pada abad ke-18 melalui pemecahan masalah jembatan Konigsberg. Dalam kerangka teori graf, sebuah jaringan direpresentasikan sebagai kumpulan simpul (nodes atau vertices) yang saling terhubung melalui sisi (edges). Wasserman dan Faust (1994) mengadaptasi kerangka matematis ini ke dalam ranah ilmu sosial dengan menegaskan bahwa perilaku dan sikap individu tidak dapat dipahami secara utuh apabila dianalisis secara terisolasi, melainkan harus dipahami sebagai produk dari posisi individu tersebut dalam struktur relasi sosial yang lebih luas.</w:t>
+      </w:r>
+    </w:p>
+    <w:p>
+      <w:pPr>
+        <w:pStyle w:val="BodyText"/>
+      </w:pPr>
+      <w:r>
+        <w:t xml:space="preserve">Dalam konteks penelitian ini, setiap akun pengguna platform X yang berinteraksi dalam diskursus MBG direpresentasikan sebagai simpul (node), sementara interaksi berupa balasan, sebar ulang, atau sebutan direpresentasikan sebagai sisi (edge) yang menghubungkan simpul-simpul tersebut. Representasi graf ini memungkinkan penerapan berbagai metrik matematis untuk mengukur posisi dan peran setiap simpul dalam keseluruhan struktur jaringan, sebagaimana dijelaskan pada subbagian berikut.</w:t>
+      </w:r>
+    </w:p>
+    <w:p>
+      <w:pPr>
+        <w:pStyle w:val="BodyText"/>
       </w:pPr>
       <w:r>
         <w:rPr>
           <w:bCs/>
           <w:b/>
         </w:rPr>
-        <w:t xml:space="preserve">2.6.1 Dasar-Dasar Teori Graf.</w:t>
-      </w:r>
-      <w:r>
-        <w:t xml:space="preserve"> </w:t>
-      </w:r>
-      <w:r>
-        <w:t xml:space="preserve">Social Network Analysis (SNA) berakar dari cabang matematika yang disebut teori graf (graph theory), yang pertama kali dirumuskan secara formal oleh Leonhard Euler pada abad ke-18 melalui pemecahan masalah jembatan Konigsberg. Dalam kerangka teori graf, sebuah jaringan direpresentasikan sebagai kumpulan simpul (nodes atau vertices) yang saling terhubung melalui sisi (edges). Wasserman dan Faust (1994) mengadaptasi kerangka matematis ini ke dalam ranah ilmu sosial dengan menegaskan bahwa perilaku dan sikap individu tidak dapat dipahami secara utuh apabila dianalisis secara terisolasi, melainkan harus dipahami sebagai produk dari posisi individu tersebut dalam struktur relasi sosial yang lebih luas.</w:t>
-      </w:r>
-    </w:p>
-    <w:p>
-      <w:pPr>
-        <w:pStyle w:val="BodyText"/>
-      </w:pPr>
-      <w:r>
-        <w:t xml:space="preserve">Dalam konteks penelitian ini, setiap akun pengguna platform X yang berinteraksi dalam diskursus MBG direpresentasikan sebagai simpul (node), sementara interaksi berupa balasan, sebar ulang, atau sebutan direpresentasikan sebagai sisi (edge) yang menghubungkan simpul-simpul tersebut. Representasi graf ini memungkinkan penerapan berbagai metrik matematis untuk mengukur posisi dan peran setiap simpul dalam keseluruhan struktur jaringan, sebagaimana dijelaskan pada subbagian berikut.</w:t>
+        <w:t xml:space="preserve">2.6.2 Sentralitas dalam Jaringan.</w:t>
+      </w:r>
+      <w:r>
+        <w:t xml:space="preserve"> </w:t>
+      </w:r>
+      <w:r>
+        <w:t xml:space="preserve">Konsep sentralitas (centrality) dikembangkan untuk mengidentifikasi simpul-simpul yang memiliki peran atau pengaruh penting dalam sebuah jaringan. Freeman (1979) merumuskan tiga ukuran sentralitas klasik yang hingga kini menjadi rujukan utama dalam SNA. Pertama, degree centrality, yang mengukur jumlah koneksi langsung yang dimiliki sebuah simpul; semakin banyak koneksi langsung, semakin tinggi visibilitas simpul tersebut dalam jaringan. Kedua, betweenness centrality, yang mengukur seberapa sering sebuah simpul berada pada jalur terpendek yang menghubungkan pasangan simpul lain dalam jaringan; simpul dengan betweenness tinggi berperan sebagai jembatan (broker) yang menghubungkan kelompok-kelompok yang berbeda, meski jumlah koneksi langsungnya tidak selalu paling banyak. Ketiga, closeness centrality, yang mengukur seberapa dekat sebuah simpul dengan seluruh simpul lain dalam jaringan, mencerminkan efisiensi sebuah simpul dalam menyebarkan atau menerima informasi ke seluruh jaringan.</w:t>
+      </w:r>
+    </w:p>
+    <w:p>
+      <w:pPr>
+        <w:pStyle w:val="BodyText"/>
+      </w:pPr>
+      <w:r>
+        <w:t xml:space="preserve">Bonacich (1987) menambahkan ukuran keempat, yaitu eigenvector centrality, yang mempertimbangkan bukan hanya jumlah koneksi sebuah simpul, melainkan juga kualitas atau pengaruh dari simpul-simpul yang terhubung dengannya; sebuah simpul dianggap penting apabila ia terhubung dengan simpul-simpul lain yang juga penting. Dalam konteks penelitian ini, kombinasi keempat ukuran sentralitas tersebut akan digunakan untuk mengidentifikasi aktor dominan dalam diskursus MBG, membedakan antara aktor yang berperan sebagai episentrum narasi (degree dan eigenvector tinggi) dengan aktor yang berperan sebagai penjembatan antarklaster (betweenness tinggi), sebagaimana dirumuskan pada tujuan penelitian keempat di Bab I.</w:t>
       </w:r>
     </w:p>
     <w:p>
@@ -3998,21 +3966,21 @@
           <w:bCs/>
           <w:b/>
         </w:rPr>
-        <w:t xml:space="preserve">2.6.2 Sentralitas dalam Jaringan.</w:t>
-      </w:r>
-      <w:r>
-        <w:t xml:space="preserve"> </w:t>
-      </w:r>
-      <w:r>
-        <w:t xml:space="preserve">Konsep sentralitas (centrality) dikembangkan untuk mengidentifikasi simpul-simpul yang memiliki peran atau pengaruh penting dalam sebuah jaringan. Freeman (1979) merumuskan tiga ukuran sentralitas klasik yang hingga kini menjadi rujukan utama dalam SNA. Pertama, degree centrality, yang mengukur jumlah koneksi langsung yang dimiliki sebuah simpul; semakin banyak koneksi langsung, semakin tinggi visibilitas simpul tersebut dalam jaringan. Kedua, betweenness centrality, yang mengukur seberapa sering sebuah simpul berada pada jalur terpendek yang menghubungkan pasangan simpul lain dalam jaringan; simpul dengan betweenness tinggi berperan sebagai jembatan (broker) yang menghubungkan kelompok-kelompok yang berbeda, meski jumlah koneksi langsungnya tidak selalu paling banyak. Ketiga, closeness centrality, yang mengukur seberapa dekat sebuah simpul dengan seluruh simpul lain dalam jaringan, mencerminkan efisiensi sebuah simpul dalam menyebarkan atau menerima informasi ke seluruh jaringan.</w:t>
-      </w:r>
-    </w:p>
-    <w:p>
-      <w:pPr>
-        <w:pStyle w:val="BodyText"/>
-      </w:pPr>
-      <w:r>
-        <w:t xml:space="preserve">Bonacich (1987) menambahkan ukuran keempat, yaitu eigenvector centrality, yang mempertimbangkan bukan hanya jumlah koneksi sebuah simpul, melainkan juga kualitas atau pengaruh dari simpul-simpul yang terhubung dengannya; sebuah simpul dianggap penting apabila ia terhubung dengan simpul-simpul lain yang juga penting. Dalam konteks penelitian ini, kombinasi keempat ukuran sentralitas tersebut akan digunakan untuk mengidentifikasi aktor dominan dalam diskursus MBG, membedakan antara aktor yang berperan sebagai episentrum narasi (degree dan eigenvector tinggi) dengan aktor yang berperan sebagai penjembatan antarklaster (betweenness tinggi), sebagaimana dirumuskan pada tujuan penelitian keempat di Bab I.</w:t>
+        <w:t xml:space="preserve">2.6.3 Deteksi Komunitas dan Algoritma Louvain.</w:t>
+      </w:r>
+      <w:r>
+        <w:t xml:space="preserve"> </w:t>
+      </w:r>
+      <w:r>
+        <w:t xml:space="preserve">Selain mengukur peran individu simpul, SNA juga menyediakan perangkat untuk mengidentifikasi pengelompokan (community detection), yaitu proses mengelompokkan simpul-simpul yang memiliki kepadatan koneksi internal lebih tinggi dibandingkan koneksinya dengan simpul-simpul di luar kelompok tersebut. Salah satu algoritma deteksi komunitas yang paling banyak digunakan adalah algoritma Louvain, yang dikembangkan Blondel, Guillaume, Lambiotte, dan Lefebvre (2008). Algoritma ini bekerja secara iteratif dan bertahap (greedy optimization), dimulai dengan menempatkan setiap simpul sebagai komunitasnya sendiri, kemudian secara bertahap menggabungkan simpul-simpul ke dalam komunitas yang memaksimalkan nilai modularity jaringan, hingga tidak ada lagi penggabungan yang dapat meningkatkan modularity secara signifikan.</w:t>
+      </w:r>
+    </w:p>
+    <w:p>
+      <w:pPr>
+        <w:pStyle w:val="BodyText"/>
+      </w:pPr>
+      <w:r>
+        <w:t xml:space="preserve">Keunggulan algoritma Louvain terletak pada efisiensi komputasinya yang memungkinkan analisis pada jaringan berskala besar dengan ribuan simpul dan sisi, meski pada penjajakan awal jaringan mention di penelitian ini justru relatif jarang (973 aktor, 658 relasi mention) dan sangat terfragmentasi menjadi 332 komponen kecil sebagaimana disebutkan pada Bab I — sebuah karakteristik yang membedakannya dari jaringan reply/retweet berskala penuh, dan menuntut kehati-hatian dalam menginterpretasikan hasil deteksi komunitasnya. Selain efisiensi, algoritma ini juga menghasilkan struktur komunitas berjenjang (hierarchical community structure) yang memungkinkan analisis pada berbagai tingkat resolusi, dari klaster besar hingga sub-klaster yang lebih kecil dan spesifik.</w:t>
       </w:r>
     </w:p>
     <w:p>
@@ -4024,21 +3992,21 @@
           <w:bCs/>
           <w:b/>
         </w:rPr>
-        <w:t xml:space="preserve">2.6.3 Deteksi Komunitas dan Algoritma Louvain.</w:t>
-      </w:r>
-      <w:r>
-        <w:t xml:space="preserve"> </w:t>
-      </w:r>
-      <w:r>
-        <w:t xml:space="preserve">Selain mengukur peran individu simpul, SNA juga menyediakan perangkat untuk mengidentifikasi pengelompokan (community detection), yaitu proses mengelompokkan simpul-simpul yang memiliki kepadatan koneksi internal lebih tinggi dibandingkan koneksinya dengan simpul-simpul di luar kelompok tersebut. Salah satu algoritma deteksi komunitas yang paling banyak digunakan adalah algoritma Louvain, yang dikembangkan Blondel, Guillaume, Lambiotte, dan Lefebvre (2008). Algoritma ini bekerja secara iteratif dan bertahap (greedy optimization), dimulai dengan menempatkan setiap simpul sebagai komunitasnya sendiri, kemudian secara bertahap menggabungkan simpul-simpul ke dalam komunitas yang memaksimalkan nilai modularity jaringan, hingga tidak ada lagi penggabungan yang dapat meningkatkan modularity secara signifikan.</w:t>
-      </w:r>
-    </w:p>
-    <w:p>
-      <w:pPr>
-        <w:pStyle w:val="BodyText"/>
-      </w:pPr>
-      <w:r>
-        <w:t xml:space="preserve">Keunggulan algoritma Louvain terletak pada efisiensi komputasinya yang memungkinkan analisis pada jaringan berskala besar dengan ribuan simpul dan sisi, meski pada penjajakan awal jaringan mention di penelitian ini justru relatif jarang (973 aktor, 658 relasi mention) dan sangat terfragmentasi menjadi 332 komponen kecil sebagaimana disebutkan pada Bab I — sebuah karakteristik yang membedakannya dari jaringan reply/retweet berskala penuh, dan menuntut kehati-hatian dalam menginterpretasikan hasil deteksi komunitasnya. Selain efisiensi, algoritma ini juga menghasilkan struktur komunitas berjenjang (hierarchical community structure) yang memungkinkan analisis pada berbagai tingkat resolusi, dari klaster besar hingga sub-klaster yang lebih kecil dan spesifik.</w:t>
+        <w:t xml:space="preserve">2.6.4 Modularity sebagai Ukuran Polarisasi.</w:t>
+      </w:r>
+      <w:r>
+        <w:t xml:space="preserve"> </w:t>
+      </w:r>
+      <w:r>
+        <w:t xml:space="preserve">Modularity, sebagaimana dirumuskan Newman dan Girvan (2004), adalah metrik yang mengukur kekuatan pembagian sebuah jaringan ke dalam komunitas-komunitas, dengan cara membandingkan kepadatan koneksi aktual di dalam komunitas dengan kepadatan koneksi yang diharapkan secara acak apabila jaringan tersebut tidak memiliki struktur komunitas sama sekali. Nilai modularity berkisar antara -1 hingga 1, dengan nilai yang lebih tinggi menandakan pembagian komunitas yang lebih tegas dan terisolasi satu sama lain.</w:t>
+      </w:r>
+    </w:p>
+    <w:p>
+      <w:pPr>
+        <w:pStyle w:val="BodyText"/>
+      </w:pPr>
+      <w:r>
+        <w:t xml:space="preserve">Newman (2006) mencatat bahwa nilai modularity di atas 0,3 pada umumnya sudah dianggap menunjukkan struktur komunitas yang signifikan secara statistik, sementara nilai di atas 0,6 hingga 0,7 kerap diasosiasikan dengan jaringan yang sangat terpolarisasi, di mana interaksi antarkomunitas menjadi sangat jarang dibandingkan interaksi di dalam komunitas itu sendiri. Nilai modularity yang tinggi dalam konteks diskursus kebijakan publik dapat diinterpretasikan sebagai indikasi echo chamber, yaitu kondisi ketika kelompok-kelompok warganet cenderung hanya berinteraksi dengan sesama anggota kelompoknya yang memiliki pandangan serupa, sehingga memperkuat (bukan menguji) keyakinan yang sudah dimiliki sebelumnya.</w:t>
       </w:r>
     </w:p>
     <w:p>
@@ -4050,21 +4018,21 @@
           <w:bCs/>
           <w:b/>
         </w:rPr>
-        <w:t xml:space="preserve">2.6.4 Modularity sebagai Ukuran Polarisasi.</w:t>
-      </w:r>
-      <w:r>
-        <w:t xml:space="preserve"> </w:t>
-      </w:r>
-      <w:r>
-        <w:t xml:space="preserve">Modularity, sebagaimana dirumuskan Newman dan Girvan (2004), adalah metrik yang mengukur kekuatan pembagian sebuah jaringan ke dalam komunitas-komunitas, dengan cara membandingkan kepadatan koneksi aktual di dalam komunitas dengan kepadatan koneksi yang diharapkan secara acak apabila jaringan tersebut tidak memiliki struktur komunitas sama sekali. Nilai modularity berkisar antara -1 hingga 1, dengan nilai yang lebih tinggi menandakan pembagian komunitas yang lebih tegas dan terisolasi satu sama lain.</w:t>
-      </w:r>
-    </w:p>
-    <w:p>
-      <w:pPr>
-        <w:pStyle w:val="BodyText"/>
-      </w:pPr>
-      <w:r>
-        <w:t xml:space="preserve">Newman (2006) mencatat bahwa nilai modularity di atas 0,3 pada umumnya sudah dianggap menunjukkan struktur komunitas yang signifikan secara statistik, sementara nilai di atas 0,6 hingga 0,7 kerap diasosiasikan dengan jaringan yang sangat terpolarisasi, di mana interaksi antarkomunitas menjadi sangat jarang dibandingkan interaksi di dalam komunitas itu sendiri. Nilai modularity yang tinggi dalam konteks diskursus kebijakan publik dapat diinterpretasikan sebagai indikasi echo chamber, yaitu kondisi ketika kelompok-kelompok warganet cenderung hanya berinteraksi dengan sesama anggota kelompoknya yang memiliki pandangan serupa, sehingga memperkuat (bukan menguji) keyakinan yang sudah dimiliki sebelumnya.</w:t>
+        <w:t xml:space="preserve">2.6.5 Homofili dan Fenomena Echo Chamber.</w:t>
+      </w:r>
+      <w:r>
+        <w:t xml:space="preserve"> </w:t>
+      </w:r>
+      <w:r>
+        <w:t xml:space="preserve">Kecenderungan individu untuk terhubung dengan individu lain yang memiliki karakteristik atau pandangan serupa disebut sebagai homofili (homophily), sebuah prinsip yang dirumuskan McPherson, Smith-Lovin, dan Cook (2001) sebagai salah satu prinsip paling fundamental dalam pembentukan struktur jaringan sosial. Dalam ranah media sosial, homofili berinteraksi dengan mekanisme algoritmik platform yang cenderung merekomendasikan konten dan akun yang selaras dengan preferensi pengguna, menciptakan apa yang Pariser (2011) sebut sebagai filter bubble, yaitu gelembung informasi yang secara sistematis membatasi eksposur pengguna terhadap pandangan yang berbeda dari pandangannya sendiri.</w:t>
+      </w:r>
+    </w:p>
+    <w:p>
+      <w:pPr>
+        <w:pStyle w:val="BodyText"/>
+      </w:pPr>
+      <w:r>
+        <w:t>Kombinasi antara homofili alami manusia dan filter bubble algoritmik berpotensi menjelaskan sebagian pola jaringan diskursus MBG, meski pada korpus resmi penelitian ini nilai modularity yang sangat tinggi (0,9837) justru lebih banyak didorong oleh fragmentasi struktural — jaringan mention yang jarang terpecah menjadi 332 komponen kecil, dengan komponen terbesar hanya mencakup sekitar 9 persen aktor — ketimbang oleh dua klaster ideologis besar yang saling bermusuhan sebagaimana lazim digambarkan dalam narasi echo chamber. Ketika kelompok-kelompok warganet yang skeptis terhadap MBG hanya berinteraksi secara intensif dengan sesama kelompoknya dalam komponen-komponen kecil tersebut, narasi kritis dan bernada sindiran yang beredar cenderung menguat dan mengeras (echo chamber effect) tanpa banyak mengalami tantangan atau klarifikasi dari sudut pandang yang berbeda, sebuah dinamika yang menjadi salah satu fokus analisis pada Bab IV penelitian ini, sebuah fenomena yang dianalisis secara mendalam melalui pemodelan graf berarah dan algoritma deteksi komunitas Louvain pada Bab IV.</w:t>
       </w:r>
     </w:p>
     <w:p>
@@ -4076,21 +4044,21 @@
           <w:bCs/>
           <w:b/>
         </w:rPr>
-        <w:t xml:space="preserve">2.6.5 Homofili dan Fenomena Echo Chamber.</w:t>
-      </w:r>
-      <w:r>
-        <w:t xml:space="preserve"> </w:t>
-      </w:r>
-      <w:r>
-        <w:t xml:space="preserve">Kecenderungan individu untuk terhubung dengan individu lain yang memiliki karakteristik atau pandangan serupa disebut sebagai homofili (homophily), sebuah prinsip yang dirumuskan McPherson, Smith-Lovin, dan Cook (2001) sebagai salah satu prinsip paling fundamental dalam pembentukan struktur jaringan sosial. Dalam ranah media sosial, homofili berinteraksi dengan mekanisme algoritmik platform yang cenderung merekomendasikan konten dan akun yang selaras dengan preferensi pengguna, menciptakan apa yang Pariser (2011) sebut sebagai filter bubble, yaitu gelembung informasi yang secara sistematis membatasi eksposur pengguna terhadap pandangan yang berbeda dari pandangannya sendiri.</w:t>
-      </w:r>
-    </w:p>
-    <w:p>
-      <w:pPr>
-        <w:pStyle w:val="BodyText"/>
-      </w:pPr>
-      <w:r>
-        <w:t>Kombinasi antara homofili alami manusia dan filter bubble algoritmik berpotensi menjelaskan sebagian pola jaringan diskursus MBG, meski pada korpus resmi penelitian ini nilai modularity yang sangat tinggi (0,9837) justru lebih banyak didorong oleh fragmentasi struktural — jaringan mention yang jarang terpecah menjadi 332 komponen kecil, dengan komponen terbesar hanya mencakup sekitar 9 persen aktor — ketimbang oleh dua klaster ideologis besar yang saling bermusuhan sebagaimana lazim digambarkan dalam narasi echo chamber. Ketika kelompok-kelompok warganet yang skeptis terhadap MBG hanya berinteraksi secara intensif dengan sesama kelompoknya dalam komponen-komponen kecil tersebut, narasi kritis dan bernada sindiran yang beredar cenderung menguat dan mengeras (echo chamber effect) tanpa banyak mengalami tantangan atau klarifikasi dari sudut pandang yang berbeda, sebuah dinamika yang menjadi salah satu fokus analisis pada Bab IV penelitian ini, sebuah fenomena yang dianalisis secara mendalam melalui pemodelan graf berarah dan algoritma deteksi komunitas Louvain pada Bab IV.</w:t>
+        <w:t xml:space="preserve">2.6.6 Visualisasi Jaringan sebagai Instrumen Diagnostik Kebijakan.</w:t>
+      </w:r>
+      <w:r>
+        <w:t xml:space="preserve"> </w:t>
+      </w:r>
+      <w:r>
+        <w:t xml:space="preserve">Selain metrik numerik, SNA juga menawarkan kekuatan diagnostik melalui visualisasi graf, yang memungkinkan pola-pola struktural yang sulit ditangkap lewat angka semata menjadi tampak secara intuitif. Freeman (2000) mencatat bahwa representasi visual jaringan sosial memiliki nilai heuristik tersendiri, sebab pengambil kebijakan yang tidak memiliki latar belakang analisis kuantitatif tetap dapat menangkap pola polarisasi atau dominasi aktor tertentu hanya dengan melihat tata letak (layout) graf, misalnya melalui pengelompokan warna berdasarkan komunitas hasil algoritma Louvain, atau ukuran simpul yang disesuaikan dengan nilai sentralitasnya.</w:t>
+      </w:r>
+    </w:p>
+    <w:p>
+      <w:pPr>
+        <w:pStyle w:val="BodyText"/>
+      </w:pPr>
+      <w:r>
+        <w:t xml:space="preserve">Dalam konteks penelitian ini, visualisasi jaringan menjadi salah satu luaran utama pada Bab IV, yang menampilkan peta interaksi mention pada korpus resmi (973 aktor, 658 relasi) sebagaimana diuraikan pada Bab III, dengan pewarnaan berbeda untuk setiap komunitas hasil deteksi Louvain dan ukuran simpul yang merepresentasikan nilai betweenness centrality masing-masing aktor. Pendekatan ini sejalan dengan prinsip data storytelling (Knaflic, 2015), yang menekankan bahwa visualisasi data yang efektif bukan sekadar menyajikan angka secara estetis, melainkan mengarahkan pembaca untuk menangkap satu atau dua insight kunci secara cepat, sebuah pertimbangan yang akan menjadi acuan dalam merancang tampilan visualisasi jaringan pada bab hasil penelitian.</w:t>
       </w:r>
     </w:p>
     <w:p>
@@ -4102,21 +4070,21 @@
           <w:bCs/>
           <w:b/>
         </w:rPr>
-        <w:t xml:space="preserve">2.6.6 Visualisasi Jaringan sebagai Instrumen Diagnostik Kebijakan.</w:t>
-      </w:r>
-      <w:r>
-        <w:t xml:space="preserve"> </w:t>
-      </w:r>
-      <w:r>
-        <w:t xml:space="preserve">Selain metrik numerik, SNA juga menawarkan kekuatan diagnostik melalui visualisasi graf, yang memungkinkan pola-pola struktural yang sulit ditangkap lewat angka semata menjadi tampak secara intuitif. Freeman (2000) mencatat bahwa representasi visual jaringan sosial memiliki nilai heuristik tersendiri, sebab pengambil kebijakan yang tidak memiliki latar belakang analisis kuantitatif tetap dapat menangkap pola polarisasi atau dominasi aktor tertentu hanya dengan melihat tata letak (layout) graf, misalnya melalui pengelompokan warna berdasarkan komunitas hasil algoritma Louvain, atau ukuran simpul yang disesuaikan dengan nilai sentralitasnya.</w:t>
-      </w:r>
-    </w:p>
-    <w:p>
-      <w:pPr>
-        <w:pStyle w:val="BodyText"/>
-      </w:pPr>
-      <w:r>
-        <w:t xml:space="preserve">Dalam konteks penelitian ini, visualisasi jaringan menjadi salah satu luaran utama pada Bab IV, yang menampilkan peta interaksi mention pada korpus resmi (973 aktor, 658 relasi) sebagaimana diuraikan pada Bab III, dengan pewarnaan berbeda untuk setiap komunitas hasil deteksi Louvain dan ukuran simpul yang merepresentasikan nilai betweenness centrality masing-masing aktor. Pendekatan ini sejalan dengan prinsip data storytelling (Knaflic, 2015), yang menekankan bahwa visualisasi data yang efektif bukan sekadar menyajikan angka secara estetis, melainkan mengarahkan pembaca untuk menangkap satu atau dua insight kunci secara cepat, sebuah pertimbangan yang akan menjadi acuan dalam merancang tampilan visualisasi jaringan pada bab hasil penelitian.</w:t>
+        <w:t xml:space="preserve">2.6.7 Jaringan Bipartit dan Keterbatasan Representasi Graf Sederhana.</w:t>
+      </w:r>
+      <w:r>
+        <w:t xml:space="preserve"> </w:t>
+      </w:r>
+      <w:r>
+        <w:t xml:space="preserve">Representasi graf yang digunakan dalam kebanyakan studi SNA, termasuk penelitian ini pada dasarnya, adalah graf unipartit (unipartite graph), yaitu graf yang hanya memuat satu jenis simpul (dalam hal ini, akun pengguna). Borgatti dan Everett (1997) menjelaskan bahwa terdapat pula representasi graf bipartit (two-mode network), yang memuat dua jenis simpul sekaligus, misalnya simpul akun pengguna dan simpul topik atau tagar (hashtag) yang mereka gunakan, dengan sisi yang menghubungkan pengguna ke topik yang mereka bahas, alih-alih menghubungkan pengguna dengan pengguna lain secara langsung.</w:t>
+      </w:r>
+    </w:p>
+    <w:p>
+      <w:pPr>
+        <w:pStyle w:val="BodyText"/>
+      </w:pPr>
+      <w:r>
+        <w:t xml:space="preserve">Sekalipun penelitian ini memilih representasi unipartit sesuai dengan Batasan Masalah yang ditetapkan pada Bab I (fokus pada interaksi reply, retweet, dan mention antarakun), pemahaman mengenai keberadaan representasi bipartit tetap penting untuk memetakan potensi pengembangan metodologis di masa mendatang, misalnya untuk menganalisis bagaimana topik-topik spesifik (seperti tagar terkait MBG) menghubungkan kelompok-kelompok pengguna yang secara struktural terpisah dalam graf interaksi langsung namun ternyata membahas isu yang sama. Keterbatasan cakupan analisis jaringan pada representasi unipartit ini akan dicatat kembali sebagai salah satu keterbatasan metodologis pada Bab V penelitian.</w:t>
       </w:r>
     </w:p>
     <w:p>
@@ -4128,32 +4096,6 @@
           <w:bCs/>
           <w:b/>
         </w:rPr>
-        <w:t xml:space="preserve">2.6.7 Jaringan Bipartit dan Keterbatasan Representasi Graf Sederhana.</w:t>
-      </w:r>
-      <w:r>
-        <w:t xml:space="preserve"> </w:t>
-      </w:r>
-      <w:r>
-        <w:t xml:space="preserve">Representasi graf yang digunakan dalam kebanyakan studi SNA, termasuk penelitian ini pada dasarnya, adalah graf unipartit (unipartite graph), yaitu graf yang hanya memuat satu jenis simpul (dalam hal ini, akun pengguna). Borgatti dan Everett (1997) menjelaskan bahwa terdapat pula representasi graf bipartit (two-mode network), yang memuat dua jenis simpul sekaligus, misalnya simpul akun pengguna dan simpul topik atau tagar (hashtag) yang mereka gunakan, dengan sisi yang menghubungkan pengguna ke topik yang mereka bahas, alih-alih menghubungkan pengguna dengan pengguna lain secara langsung.</w:t>
-      </w:r>
-    </w:p>
-    <w:p>
-      <w:pPr>
-        <w:pStyle w:val="BodyText"/>
-      </w:pPr>
-      <w:r>
-        <w:t xml:space="preserve">Sekalipun penelitian ini memilih representasi unipartit sesuai dengan Batasan Masalah yang ditetapkan pada Bab I (fokus pada interaksi reply, retweet, dan mention antarakun), pemahaman mengenai keberadaan representasi bipartit tetap penting untuk memetakan potensi pengembangan metodologis di masa mendatang, misalnya untuk menganalisis bagaimana topik-topik spesifik (seperti tagar terkait MBG) menghubungkan kelompok-kelompok pengguna yang secara struktural terpisah dalam graf interaksi langsung namun ternyata membahas isu yang sama. Keterbatasan cakupan analisis jaringan pada representasi unipartit ini akan dicatat kembali sebagai salah satu keterbatasan metodologis pada Bab V penelitian.</w:t>
-      </w:r>
-    </w:p>
-    <w:p>
-      <w:pPr>
-        <w:pStyle w:val="BodyText"/>
-      </w:pPr>
-      <w:r>
-        <w:rPr>
-          <w:bCs/>
-          <w:b/>
-        </w:rPr>
         <w:t xml:space="preserve">2.6.8 Perbandingan Algoritma Deteksi Komunitas.</w:t>
       </w:r>
       <w:r>
@@ -4168,7 +4110,7 @@
         <w:pStyle w:val="BodyText"/>
       </w:pPr>
       <w:r>
-        <w:t xml:space="preserve">Algoritma lain yang juga populer adalah Label Propagation (Raghavan, Albert, &amp; Kumara, 2007), yang bekerja dengan menyebarkan label komunitas antarsimpul bertetangga secara iteratif hingga mencapai konsensus lokal. Algoritma ini unggul dari sisi kecepatan komputasi, namun rentan menghasilkan hasil yang tidak stabil (berbeda-beda pada setiap pengulangan) akibat sifatnya yang sangat bergantung pada urutan pemrosesan simpul secara acak. Mempertimbangkan trade-off antara akurasi, stabilitas, dan efisiensi komputasi, algoritma Louvain dipandang sebagai pilihan yang paling seimbang untuk kebutuhan penelitian ini, sejalan dengan preseden penggunaannya pada studi SNA sejenis oleh Wibowo dkk. (2024) sebagaimana telah diuraikan pada Kajian Penelitian Terdahulu di Bab I.</w:t>
+        <w:t>Algoritma lain yang juga populer adalah Label Propagation (Raghavan, Albert, &amp; Kumara, 2007), yang bekerja dengan menyebarkan label komunitas antarsimpul bertetangga secara iteratif hingga mencapai konsensus lokal. Algoritma ini unggul dari sisi kecepatan komputasi, namun rentan menghasilkan hasil yang tidak stabil (berbeda-beda pada setiap pengulangan) akibat sifatnya yang sangat bergantung pada urutan pemrosesan simpul secara acak. Mempertimbangkan trade-off antara akurasi, stabilitas, dan efisiensi komputasi, algoritma Louvain dipandang sebagai pilihan yang paling seimbang untuk kebutuhan penelitian ini, sejalan dengan preseden penggunaannya pada studi SNA sejenis oleh Suaib &amp; Pratiwi (2025) sebagaimana telah diuraikan pada Kajian Penelitian Terdahulu di Bab I.</w:t>
       </w:r>
     </w:p>
     <w:p>
@@ -11850,72 +11792,6 @@
       </w:r>
       <w:r>
         <w:t xml:space="preserve">.</w:t>
-      </w:r>
-    </w:p>
-    <w:p>
-      <w:pPr>
-        <w:pStyle w:val="BlockText"/>
-      </w:pPr>
-      <w:r>
-        <w:rPr>
-          <w:bCs/>
-          <w:b/>
-        </w:rPr>
-        <w:t xml:space="preserve">Catatan verifikasi:</w:t>
-      </w:r>
-      <w:r>
-        <w:t xml:space="preserve"> </w:t>
-      </w:r>
-      <w:r>
-        <w:t xml:space="preserve">Tiga sitasi berikut ditemukan pada naskah BAB I/II namun belum terverifikasi keberadaannya secara independen oleh penulis pada saat penyusunan draf ini, sehingga wajib dicek ulang sebelum sidang:</w:t>
-      </w:r>
-      <w:r>
-        <w:t xml:space="preserve"> </w:t>
-      </w:r>
-      <w:r>
-        <w:rPr>
-          <w:bCs/>
-          <w:b/>
-        </w:rPr>
-        <w:t xml:space="preserve">Wibowo dkk. (2024)</w:t>
-      </w:r>
-      <w:r>
-        <w:t xml:space="preserve"> </w:t>
-      </w:r>
-      <w:r>
-        <w:t xml:space="preserve">— SNA pada diskursus politik media sosial Indonesia;</w:t>
-      </w:r>
-      <w:r>
-        <w:t xml:space="preserve"> </w:t>
-      </w:r>
-      <w:r>
-        <w:rPr>
-          <w:bCs/>
-          <w:b/>
-        </w:rPr>
-        <w:t xml:space="preserve">Fera Fanesya dkk. (2019)</w:t>
-      </w:r>
-      <w:r>
-        <w:t xml:space="preserve"> </w:t>
-      </w:r>
-      <w:r>
-        <w:t xml:space="preserve">— analisis sentimen Naïve Bayes;</w:t>
-      </w:r>
-      <w:r>
-        <w:t xml:space="preserve"> </w:t>
-      </w:r>
-      <w:r>
-        <w:rPr>
-          <w:bCs/>
-          <w:b/>
-        </w:rPr>
-        <w:t xml:space="preserve">Arianto (2023)</w:t>
-      </w:r>
-      <w:r>
-        <w:t xml:space="preserve"> </w:t>
-      </w:r>
-      <w:r>
-        <w:t xml:space="preserve">— sumber asal platform ASIGTA (relevan hanya jika referensi ASIGTA suatu saat dikembalikan).</w:t>
       </w:r>
     </w:p>
     <w:bookmarkEnd w:id="75"/>

</xml_diff>